<commit_message>
docs: update synopsis report (condensed, 13 pages)
Regenerates the report PDF from the edited DOCX and refreshes both in the
submission pack. The README page count is updated to match.

No secrets or credentials are included; the pack was scanned before commit.
</commit_message>
<xml_diff>
--- a/project-docs/final-year-submission/report/Hustlrzz_Report.docx
+++ b/project-docs/final-year-submission/report/Hustlrzz_Report.docx
@@ -1,6 +1,6 @@
 
 <file path=word/document.xml><?xml version="1.0" encoding="utf-8"?>
-<w:document xmlns:wpc="http://schemas.microsoft.com/office/word/2010/wordprocessingCanvas" xmlns:cx="http://schemas.microsoft.com/office/drawing/2014/chartex" xmlns:cx1="http://schemas.microsoft.com/office/drawing/2015/9/8/chartex" xmlns:cx2="http://schemas.microsoft.com/office/drawing/2015/10/21/chartex" xmlns:cx3="http://schemas.microsoft.com/office/drawing/2016/5/9/chartex" xmlns:cx4="http://schemas.microsoft.com/office/drawing/2016/5/10/chartex" xmlns:cx5="http://schemas.microsoft.com/office/drawing/2016/5/11/chartex" xmlns:cx6="http://schemas.microsoft.com/office/drawing/2016/5/12/chartex" xmlns:cx7="http://schemas.microsoft.com/office/drawing/2016/5/13/chartex" xmlns:cx8="http://schemas.microsoft.com/office/drawing/2016/5/14/chartex" xmlns:mc="http://schemas.openxmlformats.org/markup-compatibility/2006" xmlns:aink="http://schemas.microsoft.com/office/drawing/2016/ink" xmlns:am3d="http://schemas.microsoft.com/office/drawing/2017/model3d" xmlns:o="urn:schemas-microsoft-com:office:office" xmlns:oel="http://schemas.microsoft.com/office/2019/extlst" xmlns:r="http://schemas.openxmlformats.org/officeDocument/2006/relationships" xmlns:m="http://schemas.openxmlformats.org/officeDocument/2006/math" xmlns:v="urn:schemas-microsoft-com:vml" xmlns:wp14="http://schemas.microsoft.com/office/word/2010/wordprocessingDrawing" xmlns:wp="http://schemas.openxmlformats.org/drawingml/2006/wordprocessingDrawing" xmlns:w10="urn:schemas-microsoft-com:office:word" xmlns:w="http://schemas.openxmlformats.org/wordprocessingml/2006/main" xmlns:w14="http://schemas.microsoft.com/office/word/2010/wordml" xmlns:w15="http://schemas.microsoft.com/office/word/2012/wordml" xmlns:w16cex="http://schemas.microsoft.com/office/word/2018/wordml/cex" xmlns:w16cid="http://schemas.microsoft.com/office/word/2016/wordml/cid" xmlns:w16="http://schemas.microsoft.com/office/word/2018/wordml" xmlns:w16sdtdh="http://schemas.microsoft.com/office/word/2020/wordml/sdtdatahash" xmlns:w16se="http://schemas.microsoft.com/office/word/2015/wordml/symex" xmlns:wpg="http://schemas.microsoft.com/office/word/2010/wordprocessingGroup" xmlns:wpi="http://schemas.microsoft.com/office/word/2010/wordprocessingInk" xmlns:wne="http://schemas.microsoft.com/office/word/2006/wordml" xmlns:wps="http://schemas.microsoft.com/office/word/2010/wordprocessingShape" mc:Ignorable="w14 w15 w16se w16cid w16 w16cex w16sdtdh wp14">
+<w:document xmlns:wpc="http://schemas.microsoft.com/office/word/2010/wordprocessingCanvas" xmlns:cx="http://schemas.microsoft.com/office/drawing/2014/chartex" xmlns:cx1="http://schemas.microsoft.com/office/drawing/2015/9/8/chartex" xmlns:cx2="http://schemas.microsoft.com/office/drawing/2015/10/21/chartex" xmlns:cx3="http://schemas.microsoft.com/office/drawing/2016/5/9/chartex" xmlns:cx4="http://schemas.microsoft.com/office/drawing/2016/5/10/chartex" xmlns:cx5="http://schemas.microsoft.com/office/drawing/2016/5/11/chartex" xmlns:cx6="http://schemas.microsoft.com/office/drawing/2016/5/12/chartex" xmlns:cx7="http://schemas.microsoft.com/office/drawing/2016/5/13/chartex" xmlns:cx8="http://schemas.microsoft.com/office/drawing/2016/5/14/chartex" xmlns:mc="http://schemas.openxmlformats.org/markup-compatibility/2006" xmlns:aink="http://schemas.microsoft.com/office/drawing/2016/ink" xmlns:am3d="http://schemas.microsoft.com/office/drawing/2017/model3d" xmlns:o="urn:schemas-microsoft-com:office:office" xmlns:r="http://schemas.openxmlformats.org/officeDocument/2006/relationships" xmlns:m="http://schemas.openxmlformats.org/officeDocument/2006/math" xmlns:v="urn:schemas-microsoft-com:vml" xmlns:wp14="http://schemas.microsoft.com/office/word/2010/wordprocessingDrawing" xmlns:wp="http://schemas.openxmlformats.org/drawingml/2006/wordprocessingDrawing" xmlns:w10="urn:schemas-microsoft-com:office:word" xmlns:w="http://schemas.openxmlformats.org/wordprocessingml/2006/main" xmlns:w14="http://schemas.microsoft.com/office/word/2010/wordml" xmlns:w15="http://schemas.microsoft.com/office/word/2012/wordml" xmlns:w16cex="http://schemas.microsoft.com/office/word/2018/wordml/cex" xmlns:w16cid="http://schemas.microsoft.com/office/word/2016/wordml/cid" xmlns:w16="http://schemas.microsoft.com/office/word/2018/wordml" xmlns:w16se="http://schemas.microsoft.com/office/word/2015/wordml/symex" xmlns:wpg="http://schemas.microsoft.com/office/word/2010/wordprocessingGroup" xmlns:wpi="http://schemas.microsoft.com/office/word/2010/wordprocessingInk" xmlns:wne="http://schemas.microsoft.com/office/word/2006/wordml" xmlns:wps="http://schemas.microsoft.com/office/word/2010/wordprocessingShape" mc:Ignorable="w14 w15 w16se w16cid w16 w16cex wp14">
   <w:body>
     <w:p>
       <w:pPr>
@@ -553,7 +553,16 @@
           <w:b/>
           <w:bCs/>
         </w:rPr>
-        <w:t>Er. Ashish</w:t>
+        <w:t>M</w:t>
+      </w:r>
+      <w:r>
+        <w:rPr>
+          <w:rStyle w:val="normaltextrun"/>
+          <w:rFonts w:eastAsiaTheme="majorEastAsia"/>
+          <w:b/>
+          <w:bCs/>
+        </w:rPr>
+        <w:t>r. Ashish</w:t>
       </w:r>
       <w:r>
         <w:rPr>
@@ -766,7 +775,25 @@
           <w:b/>
           <w:bCs/>
         </w:rPr>
-        <w:t>September 2026</w:t>
+        <w:t>September</w:t>
+      </w:r>
+      <w:r>
+        <w:rPr>
+          <w:rStyle w:val="normaltextrun"/>
+          <w:rFonts w:cs="Times New Roman"/>
+          <w:b/>
+          <w:bCs/>
+        </w:rPr>
+        <w:t xml:space="preserve">, </w:t>
+      </w:r>
+      <w:r>
+        <w:rPr>
+          <w:rStyle w:val="normaltextrun"/>
+          <w:rFonts w:cs="Times New Roman"/>
+          <w:b/>
+          <w:bCs/>
+        </w:rPr>
+        <w:t>2026</w:t>
       </w:r>
     </w:p>
     <w:p>
@@ -811,13 +838,14 @@
           <w:szCs w:val="32"/>
         </w:rPr>
       </w:pPr>
-      <w:bookmarkStart w:id="0" w:name="_Toc241399975"/>
+      <w:bookmarkStart w:id="0" w:name="_Toc241585799"/>
       <w:r>
         <w:rPr>
           <w:rFonts w:ascii="Times New Roman" w:hAnsi="Times New Roman" w:cs="Times New Roman"/>
           <w:sz w:val="32"/>
           <w:szCs w:val="32"/>
         </w:rPr>
+        <w:lastRenderedPageBreak/>
         <w:t>ACKNOWLEDGEMENT</w:t>
       </w:r>
       <w:bookmarkEnd w:id="0"/>
@@ -844,17 +872,31 @@
           <w:b/>
           <w:bCs/>
         </w:rPr>
-        <w:t xml:space="preserve">Project Guide and Head of Information Technology Department, Er. Ashish Agrawal </w:t>
-      </w:r>
-      <w:r>
-        <w:t xml:space="preserve">and our </w:t>
+        <w:t xml:space="preserve">Project Guide and Head of Information Technology Department, </w:t>
       </w:r>
       <w:r>
         <w:rPr>
           <w:b/>
           <w:bCs/>
         </w:rPr>
-        <w:t xml:space="preserve">Project Incharge, Ms. Sakshi Goel</w:t>
+        <w:t>M</w:t>
+      </w:r>
+      <w:r>
+        <w:rPr>
+          <w:b/>
+          <w:bCs/>
+        </w:rPr>
+        <w:t xml:space="preserve">r. Ashish Agrawal </w:t>
+      </w:r>
+      <w:r>
+        <w:t xml:space="preserve">and our </w:t>
+      </w:r>
+      <w:r>
+        <w:rPr>
+          <w:b/>
+          <w:bCs/>
+        </w:rPr>
+        <w:t>Project Incharge, Ms. Sakshi Goel</w:t>
       </w:r>
       <w:r>
         <w:t xml:space="preserve"> for their invaluable guidance, constant support and encouragement throughout our major project on </w:t>
@@ -914,7 +956,7 @@
         <w:jc w:val="both"/>
       </w:pPr>
       <w:r>
-        <w:t xml:space="preserve">We also extend our sincere thanks to the faculty and staff of SRMS CET  for providing us with the necessary resources, facilities, and a supportive academic environment throughout the project.</w:t>
+        <w:t>We also extend our sincere thanks to the faculty and staff of SRMS CET  for providing us with the necessary resources, facilities, and a supportive academic environment throughout the project.</w:t>
       </w:r>
     </w:p>
     <w:p>
@@ -991,8 +1033,23 @@
           <w:rFonts w:cs="Times New Roman"/>
         </w:rPr>
         <w:t>Signature..................</w:t>
+      </w:r>
+      <w:r>
+        <w:rPr>
+          <w:rFonts w:cs="Times New Roman"/>
+        </w:rPr>
         <w:tab/>
+      </w:r>
+      <w:r>
+        <w:rPr>
+          <w:rFonts w:cs="Times New Roman"/>
+        </w:rPr>
         <w:tab/>
+      </w:r>
+      <w:r>
+        <w:rPr>
+          <w:rFonts w:cs="Times New Roman"/>
+        </w:rPr>
         <w:tab/>
         <w:t xml:space="preserve">                                                                               Signature....................</w:t>
       </w:r>
@@ -1008,9 +1065,24 @@
         <w:rPr>
           <w:rFonts w:cs="Times New Roman"/>
         </w:rPr>
-        <w:t xml:space="preserve">Name: Arsh Yar Khan</w:t>
+        <w:t>Name: Arsh Yar Khan</w:t>
+      </w:r>
+      <w:r>
+        <w:rPr>
+          <w:rFonts w:cs="Times New Roman"/>
+        </w:rPr>
         <w:tab/>
+      </w:r>
+      <w:r>
+        <w:rPr>
+          <w:rFonts w:cs="Times New Roman"/>
+        </w:rPr>
         <w:tab/>
+      </w:r>
+      <w:r>
+        <w:rPr>
+          <w:rFonts w:cs="Times New Roman"/>
+        </w:rPr>
         <w:tab/>
         <w:t xml:space="preserve">                                                                           Name: Deepak Gangwar</w:t>
       </w:r>
@@ -1027,7 +1099,17 @@
           <w:rFonts w:cs="Times New Roman"/>
         </w:rPr>
         <w:t>Roll no: 2300140130013</w:t>
+      </w:r>
+      <w:r>
+        <w:rPr>
+          <w:rFonts w:cs="Times New Roman"/>
+        </w:rPr>
         <w:tab/>
+      </w:r>
+      <w:r>
+        <w:rPr>
+          <w:rFonts w:cs="Times New Roman"/>
+        </w:rPr>
         <w:tab/>
         <w:t xml:space="preserve">                                                                           Roll no: 2300140130018</w:t>
       </w:r>
@@ -1052,8 +1134,23 @@
           <w:rFonts w:cs="Times New Roman"/>
         </w:rPr>
         <w:t>Signature..................</w:t>
+      </w:r>
+      <w:r>
+        <w:rPr>
+          <w:rFonts w:cs="Times New Roman"/>
+        </w:rPr>
         <w:tab/>
+      </w:r>
+      <w:r>
+        <w:rPr>
+          <w:rFonts w:cs="Times New Roman"/>
+        </w:rPr>
         <w:tab/>
+      </w:r>
+      <w:r>
+        <w:rPr>
+          <w:rFonts w:cs="Times New Roman"/>
+        </w:rPr>
         <w:tab/>
         <w:t xml:space="preserve">                                                                              Signature....................</w:t>
       </w:r>
@@ -1069,8 +1166,18 @@
         <w:rPr>
           <w:rFonts w:cs="Times New Roman"/>
         </w:rPr>
-        <w:t xml:space="preserve">Name: Nikhil Singh</w:t>
+        <w:t>Name: Nikhil Singh</w:t>
+      </w:r>
+      <w:r>
+        <w:rPr>
+          <w:rFonts w:cs="Times New Roman"/>
+        </w:rPr>
         <w:tab/>
+      </w:r>
+      <w:r>
+        <w:rPr>
+          <w:rFonts w:cs="Times New Roman"/>
+        </w:rPr>
         <w:tab/>
         <w:t xml:space="preserve">                                                                                              Name: Riya Rastogi</w:t>
       </w:r>
@@ -1087,6 +1194,11 @@
           <w:rFonts w:cs="Times New Roman"/>
         </w:rPr>
         <w:t>Roll no: 2300140130035</w:t>
+      </w:r>
+      <w:r>
+        <w:rPr>
+          <w:rFonts w:cs="Times New Roman"/>
+        </w:rPr>
         <w:tab/>
         <w:t xml:space="preserve">                                                                                       Roll no: 2300140130043</w:t>
       </w:r>
@@ -1128,11 +1240,12 @@
           <w:rFonts w:ascii="Times New Roman" w:hAnsi="Times New Roman" w:cs="Times New Roman"/>
         </w:rPr>
       </w:pPr>
-      <w:bookmarkStart w:id="1" w:name="_Toc241399976"/>
+      <w:bookmarkStart w:id="1" w:name="_Toc241585800"/>
       <w:r>
         <w:rPr>
           <w:rFonts w:ascii="Times New Roman" w:hAnsi="Times New Roman" w:cs="Times New Roman"/>
         </w:rPr>
+        <w:lastRenderedPageBreak/>
         <w:t>ABSTRACT</w:t>
       </w:r>
       <w:bookmarkEnd w:id="1"/>
@@ -1164,7 +1277,7 @@
           <w:sz w:val="24"/>
           <w:szCs w:val="24"/>
         </w:rPr>
-        <w:t xml:space="preserve">Preparation for job interviews today depends largely on generic question banks, irregular peer practice, and feedback that arrives too late to influence the next attempt. Candidates also find it difficult to translate the evidence already present in their resume into a convincing narrative for a specific role. Hustlrzz is proposed as a web-based, AI-powered interview-preparation and career-coaching platform that brings resume analysis, role-specific interview practice, explainable coaching insight, and progress tracking together in a single secure workspace for students, graduates, career switchers, and working professionals.</w:t>
+        <w:t>Preparation for job interviews today depends largely on generic question banks, irregular peer practice, and feedback that arrives too late to influence the next attempt. Candidates also find it difficult to translate the evidence already present in their resume into a convincing narrative for a specific role. Hustlrzz is proposed as a web-based, AI-powered interview-preparation and career-coaching platform that brings resume analysis, role-specific interview practice, explainable coaching insight, and progress tracking together in a single secure workspace for students, graduates, career switchers, and working professionals.</w:t>
       </w:r>
     </w:p>
     <w:p>
@@ -1183,7 +1296,7 @@
           <w:sz w:val="24"/>
           <w:szCs w:val="24"/>
         </w:rPr>
-        <w:t xml:space="preserve">The proposed system accepts a resume, a target job description, and optional company context, and returns a preparation pack containing role-relevant questions, answer direction, and role context. A Resume Analyzer processes PDF or DOCX files in memory to identify visible skills, likely gaps, a directional readiness score, and the single highest-value revision. A practice interview, conducted through typed or spoken responses over an authenticated WebSocket channel, produces adaptive follow-up questions and a structured session report. The platform will be implemented using Next.js and TypeScript for the interface, FastAPI for REST and WebSocket services with structured AI orchestration, and Supabase for authentication, PostgreSQL persistence, and row-level security, together with an optional pgvector-based retrieval layer restricted to candidate-approved material.</w:t>
+        <w:t>The proposed system accepts a resume, a target job description, and optional company context, and returns a preparation pack containing role-relevant questions, answer direction, and role context. A Resume Analyzer processes PDF or DOCX files in memory to identify visible skills, likely gaps, a directional readiness score, and the single highest-value revision. A practice interview, conducted through typed or spoken responses over an authenticated WebSocket channel, produces adaptive follow-up questions and a structured session report. The platform will be implemented using Next.js and TypeScript for the interface, FastAPI for REST and WebSocket services with structured AI orchestration, and Supabase for authentication, PostgreSQL persistence, and row-level security, together with an optional pgvector-based retrieval layer restricted to candidate-approved material.</w:t>
       </w:r>
     </w:p>
     <w:p>
@@ -1265,6 +1378,7 @@
           <w:sz w:val="32"/>
           <w:szCs w:val="32"/>
         </w:rPr>
+        <w:lastRenderedPageBreak/>
         <w:t>TABLE OF CONTENT</w:t>
       </w:r>
     </w:p>
@@ -1321,7 +1435,7 @@
             </w:rPr>
             <w:fldChar w:fldCharType="separate"/>
           </w:r>
-          <w:hyperlink w:anchor="_Toc241399975" w:history="1">
+          <w:hyperlink w:anchor="_Toc241585799" w:history="1">
             <w:r>
               <w:rPr>
                 <w:rStyle w:val="Hyperlink"/>
@@ -1333,10 +1447,40 @@
                 <w:webHidden/>
               </w:rPr>
               <w:tab/>
+            </w:r>
+            <w:r>
+              <w:rPr>
+                <w:webHidden/>
+              </w:rPr>
               <w:fldChar w:fldCharType="begin"/>
-              <w:instrText xml:space="preserve"> PAGEREF _Toc241399975 \h </w:instrText>
+            </w:r>
+            <w:r>
+              <w:rPr>
+                <w:webHidden/>
+              </w:rPr>
+              <w:instrText xml:space="preserve"> PAGEREF _Toc241585799 \h </w:instrText>
+            </w:r>
+            <w:r>
+              <w:rPr>
+                <w:webHidden/>
+              </w:rPr>
+            </w:r>
+            <w:r>
+              <w:rPr>
+                <w:webHidden/>
+              </w:rPr>
               <w:fldChar w:fldCharType="separate"/>
+            </w:r>
+            <w:r>
+              <w:rPr>
+                <w:webHidden/>
+              </w:rPr>
               <w:t>2</w:t>
+            </w:r>
+            <w:r>
+              <w:rPr>
+                <w:webHidden/>
+              </w:rPr>
               <w:fldChar w:fldCharType="end"/>
             </w:r>
           </w:hyperlink>
@@ -1353,7 +1497,7 @@
               <w14:ligatures w14:val="standardContextual"/>
             </w:rPr>
           </w:pPr>
-          <w:hyperlink w:anchor="_Toc241399976" w:history="1">
+          <w:hyperlink w:anchor="_Toc241585800" w:history="1">
             <w:r>
               <w:rPr>
                 <w:rStyle w:val="Hyperlink"/>
@@ -1365,10 +1509,40 @@
                 <w:webHidden/>
               </w:rPr>
               <w:tab/>
+            </w:r>
+            <w:r>
+              <w:rPr>
+                <w:webHidden/>
+              </w:rPr>
               <w:fldChar w:fldCharType="begin"/>
-              <w:instrText xml:space="preserve"> PAGEREF _Toc241399976 \h </w:instrText>
+            </w:r>
+            <w:r>
+              <w:rPr>
+                <w:webHidden/>
+              </w:rPr>
+              <w:instrText xml:space="preserve"> PAGEREF _Toc241585800 \h </w:instrText>
+            </w:r>
+            <w:r>
+              <w:rPr>
+                <w:webHidden/>
+              </w:rPr>
+            </w:r>
+            <w:r>
+              <w:rPr>
+                <w:webHidden/>
+              </w:rPr>
               <w:fldChar w:fldCharType="separate"/>
+            </w:r>
+            <w:r>
+              <w:rPr>
+                <w:webHidden/>
+              </w:rPr>
               <w:t>3</w:t>
+            </w:r>
+            <w:r>
+              <w:rPr>
+                <w:webHidden/>
+              </w:rPr>
               <w:fldChar w:fldCharType="end"/>
             </w:r>
           </w:hyperlink>
@@ -1385,7 +1559,7 @@
               <w14:ligatures w14:val="standardContextual"/>
             </w:rPr>
           </w:pPr>
-          <w:hyperlink w:anchor="_Toc241399977" w:history="1">
+          <w:hyperlink w:anchor="_Toc241585801" w:history="1">
             <w:r>
               <w:rPr>
                 <w:rStyle w:val="Hyperlink"/>
@@ -1397,10 +1571,40 @@
                 <w:webHidden/>
               </w:rPr>
               <w:tab/>
+            </w:r>
+            <w:r>
+              <w:rPr>
+                <w:webHidden/>
+              </w:rPr>
               <w:fldChar w:fldCharType="begin"/>
-              <w:instrText xml:space="preserve"> PAGEREF _Toc241399977 \h </w:instrText>
+            </w:r>
+            <w:r>
+              <w:rPr>
+                <w:webHidden/>
+              </w:rPr>
+              <w:instrText xml:space="preserve"> PAGEREF _Toc241585801 \h </w:instrText>
+            </w:r>
+            <w:r>
+              <w:rPr>
+                <w:webHidden/>
+              </w:rPr>
+            </w:r>
+            <w:r>
+              <w:rPr>
+                <w:webHidden/>
+              </w:rPr>
               <w:fldChar w:fldCharType="separate"/>
+            </w:r>
+            <w:r>
+              <w:rPr>
+                <w:webHidden/>
+              </w:rPr>
               <w:t>5</w:t>
+            </w:r>
+            <w:r>
+              <w:rPr>
+                <w:webHidden/>
+              </w:rPr>
               <w:fldChar w:fldCharType="end"/>
             </w:r>
           </w:hyperlink>
@@ -1422,7 +1626,7 @@
               <w14:ligatures w14:val="standardContextual"/>
             </w:rPr>
           </w:pPr>
-          <w:hyperlink w:anchor="_Toc241399978" w:history="1">
+          <w:hyperlink w:anchor="_Toc241585802" w:history="1">
             <w:r>
               <w:rPr>
                 <w:rStyle w:val="Hyperlink"/>
@@ -1437,10 +1641,46 @@
                 <w:webHidden/>
               </w:rPr>
               <w:tab/>
+            </w:r>
+            <w:r>
+              <w:rPr>
+                <w:noProof/>
+                <w:webHidden/>
+              </w:rPr>
               <w:fldChar w:fldCharType="begin"/>
-              <w:instrText xml:space="preserve"> PAGEREF _Toc241399978 \h </w:instrText>
+            </w:r>
+            <w:r>
+              <w:rPr>
+                <w:noProof/>
+                <w:webHidden/>
+              </w:rPr>
+              <w:instrText xml:space="preserve"> PAGEREF _Toc241585802 \h </w:instrText>
+            </w:r>
+            <w:r>
+              <w:rPr>
+                <w:noProof/>
+                <w:webHidden/>
+              </w:rPr>
+            </w:r>
+            <w:r>
+              <w:rPr>
+                <w:noProof/>
+                <w:webHidden/>
+              </w:rPr>
               <w:fldChar w:fldCharType="separate"/>
+            </w:r>
+            <w:r>
+              <w:rPr>
+                <w:noProof/>
+                <w:webHidden/>
+              </w:rPr>
               <w:t>5</w:t>
+            </w:r>
+            <w:r>
+              <w:rPr>
+                <w:noProof/>
+                <w:webHidden/>
+              </w:rPr>
               <w:fldChar w:fldCharType="end"/>
             </w:r>
           </w:hyperlink>
@@ -1462,7 +1702,7 @@
               <w14:ligatures w14:val="standardContextual"/>
             </w:rPr>
           </w:pPr>
-          <w:hyperlink w:anchor="_Toc241399979" w:history="1">
+          <w:hyperlink w:anchor="_Toc241585803" w:history="1">
             <w:r>
               <w:rPr>
                 <w:rStyle w:val="Hyperlink"/>
@@ -1477,10 +1717,46 @@
                 <w:webHidden/>
               </w:rPr>
               <w:tab/>
+            </w:r>
+            <w:r>
+              <w:rPr>
+                <w:noProof/>
+                <w:webHidden/>
+              </w:rPr>
               <w:fldChar w:fldCharType="begin"/>
-              <w:instrText xml:space="preserve"> PAGEREF _Toc241399979 \h </w:instrText>
+            </w:r>
+            <w:r>
+              <w:rPr>
+                <w:noProof/>
+                <w:webHidden/>
+              </w:rPr>
+              <w:instrText xml:space="preserve"> PAGEREF _Toc241585803 \h </w:instrText>
+            </w:r>
+            <w:r>
+              <w:rPr>
+                <w:noProof/>
+                <w:webHidden/>
+              </w:rPr>
+            </w:r>
+            <w:r>
+              <w:rPr>
+                <w:noProof/>
+                <w:webHidden/>
+              </w:rPr>
               <w:fldChar w:fldCharType="separate"/>
+            </w:r>
+            <w:r>
+              <w:rPr>
+                <w:noProof/>
+                <w:webHidden/>
+              </w:rPr>
               <w:t>5</w:t>
+            </w:r>
+            <w:r>
+              <w:rPr>
+                <w:noProof/>
+                <w:webHidden/>
+              </w:rPr>
               <w:fldChar w:fldCharType="end"/>
             </w:r>
           </w:hyperlink>
@@ -1497,7 +1773,7 @@
               <w14:ligatures w14:val="standardContextual"/>
             </w:rPr>
           </w:pPr>
-          <w:hyperlink w:anchor="_Toc241399980" w:history="1">
+          <w:hyperlink w:anchor="_Toc241585804" w:history="1">
             <w:r>
               <w:rPr>
                 <w:rStyle w:val="Hyperlink"/>
@@ -1509,10 +1785,40 @@
                 <w:webHidden/>
               </w:rPr>
               <w:tab/>
+            </w:r>
+            <w:r>
+              <w:rPr>
+                <w:webHidden/>
+              </w:rPr>
               <w:fldChar w:fldCharType="begin"/>
-              <w:instrText xml:space="preserve"> PAGEREF _Toc241399980 \h </w:instrText>
+            </w:r>
+            <w:r>
+              <w:rPr>
+                <w:webHidden/>
+              </w:rPr>
+              <w:instrText xml:space="preserve"> PAGEREF _Toc241585804 \h </w:instrText>
+            </w:r>
+            <w:r>
+              <w:rPr>
+                <w:webHidden/>
+              </w:rPr>
+            </w:r>
+            <w:r>
+              <w:rPr>
+                <w:webHidden/>
+              </w:rPr>
               <w:fldChar w:fldCharType="separate"/>
+            </w:r>
+            <w:r>
+              <w:rPr>
+                <w:webHidden/>
+              </w:rPr>
               <w:t>6</w:t>
+            </w:r>
+            <w:r>
+              <w:rPr>
+                <w:webHidden/>
+              </w:rPr>
               <w:fldChar w:fldCharType="end"/>
             </w:r>
           </w:hyperlink>
@@ -1534,7 +1840,7 @@
               <w14:ligatures w14:val="standardContextual"/>
             </w:rPr>
           </w:pPr>
-          <w:hyperlink w:anchor="_Toc241399981" w:history="1">
+          <w:hyperlink w:anchor="_Toc241585805" w:history="1">
             <w:r>
               <w:rPr>
                 <w:rStyle w:val="Hyperlink"/>
@@ -1549,10 +1855,46 @@
                 <w:webHidden/>
               </w:rPr>
               <w:tab/>
+            </w:r>
+            <w:r>
+              <w:rPr>
+                <w:noProof/>
+                <w:webHidden/>
+              </w:rPr>
               <w:fldChar w:fldCharType="begin"/>
-              <w:instrText xml:space="preserve"> PAGEREF _Toc241399981 \h </w:instrText>
+            </w:r>
+            <w:r>
+              <w:rPr>
+                <w:noProof/>
+                <w:webHidden/>
+              </w:rPr>
+              <w:instrText xml:space="preserve"> PAGEREF _Toc241585805 \h </w:instrText>
+            </w:r>
+            <w:r>
+              <w:rPr>
+                <w:noProof/>
+                <w:webHidden/>
+              </w:rPr>
+            </w:r>
+            <w:r>
+              <w:rPr>
+                <w:noProof/>
+                <w:webHidden/>
+              </w:rPr>
               <w:fldChar w:fldCharType="separate"/>
+            </w:r>
+            <w:r>
+              <w:rPr>
+                <w:noProof/>
+                <w:webHidden/>
+              </w:rPr>
               <w:t>6</w:t>
+            </w:r>
+            <w:r>
+              <w:rPr>
+                <w:noProof/>
+                <w:webHidden/>
+              </w:rPr>
               <w:fldChar w:fldCharType="end"/>
             </w:r>
           </w:hyperlink>
@@ -1574,7 +1916,7 @@
               <w14:ligatures w14:val="standardContextual"/>
             </w:rPr>
           </w:pPr>
-          <w:hyperlink w:anchor="_Toc241399982" w:history="1">
+          <w:hyperlink w:anchor="_Toc241585806" w:history="1">
             <w:r>
               <w:rPr>
                 <w:rStyle w:val="Hyperlink"/>
@@ -1589,10 +1931,46 @@
                 <w:webHidden/>
               </w:rPr>
               <w:tab/>
+            </w:r>
+            <w:r>
+              <w:rPr>
+                <w:noProof/>
+                <w:webHidden/>
+              </w:rPr>
               <w:fldChar w:fldCharType="begin"/>
-              <w:instrText xml:space="preserve"> PAGEREF _Toc241399982 \h </w:instrText>
+            </w:r>
+            <w:r>
+              <w:rPr>
+                <w:noProof/>
+                <w:webHidden/>
+              </w:rPr>
+              <w:instrText xml:space="preserve"> PAGEREF _Toc241585806 \h </w:instrText>
+            </w:r>
+            <w:r>
+              <w:rPr>
+                <w:noProof/>
+                <w:webHidden/>
+              </w:rPr>
+            </w:r>
+            <w:r>
+              <w:rPr>
+                <w:noProof/>
+                <w:webHidden/>
+              </w:rPr>
               <w:fldChar w:fldCharType="separate"/>
+            </w:r>
+            <w:r>
+              <w:rPr>
+                <w:noProof/>
+                <w:webHidden/>
+              </w:rPr>
               <w:t>6</w:t>
+            </w:r>
+            <w:r>
+              <w:rPr>
+                <w:noProof/>
+                <w:webHidden/>
+              </w:rPr>
               <w:fldChar w:fldCharType="end"/>
             </w:r>
           </w:hyperlink>
@@ -1614,7 +1992,7 @@
               <w14:ligatures w14:val="standardContextual"/>
             </w:rPr>
           </w:pPr>
-          <w:hyperlink w:anchor="_Toc241399983" w:history="1">
+          <w:hyperlink w:anchor="_Toc241585807" w:history="1">
             <w:r>
               <w:rPr>
                 <w:rStyle w:val="Hyperlink"/>
@@ -1629,10 +2007,46 @@
                 <w:webHidden/>
               </w:rPr>
               <w:tab/>
+            </w:r>
+            <w:r>
+              <w:rPr>
+                <w:noProof/>
+                <w:webHidden/>
+              </w:rPr>
               <w:fldChar w:fldCharType="begin"/>
-              <w:instrText xml:space="preserve"> PAGEREF _Toc241399983 \h </w:instrText>
+            </w:r>
+            <w:r>
+              <w:rPr>
+                <w:noProof/>
+                <w:webHidden/>
+              </w:rPr>
+              <w:instrText xml:space="preserve"> PAGEREF _Toc241585807 \h </w:instrText>
+            </w:r>
+            <w:r>
+              <w:rPr>
+                <w:noProof/>
+                <w:webHidden/>
+              </w:rPr>
+            </w:r>
+            <w:r>
+              <w:rPr>
+                <w:noProof/>
+                <w:webHidden/>
+              </w:rPr>
               <w:fldChar w:fldCharType="separate"/>
+            </w:r>
+            <w:r>
+              <w:rPr>
+                <w:noProof/>
+                <w:webHidden/>
+              </w:rPr>
               <w:t>6</w:t>
+            </w:r>
+            <w:r>
+              <w:rPr>
+                <w:noProof/>
+                <w:webHidden/>
+              </w:rPr>
               <w:fldChar w:fldCharType="end"/>
             </w:r>
           </w:hyperlink>
@@ -1654,7 +2068,7 @@
               <w14:ligatures w14:val="standardContextual"/>
             </w:rPr>
           </w:pPr>
-          <w:hyperlink w:anchor="_Toc241399984" w:history="1">
+          <w:hyperlink w:anchor="_Toc241585808" w:history="1">
             <w:r>
               <w:rPr>
                 <w:rStyle w:val="Hyperlink"/>
@@ -1669,10 +2083,46 @@
                 <w:webHidden/>
               </w:rPr>
               <w:tab/>
+            </w:r>
+            <w:r>
+              <w:rPr>
+                <w:noProof/>
+                <w:webHidden/>
+              </w:rPr>
               <w:fldChar w:fldCharType="begin"/>
-              <w:instrText xml:space="preserve"> PAGEREF _Toc241399984 \h </w:instrText>
+            </w:r>
+            <w:r>
+              <w:rPr>
+                <w:noProof/>
+                <w:webHidden/>
+              </w:rPr>
+              <w:instrText xml:space="preserve"> PAGEREF _Toc241585808 \h </w:instrText>
+            </w:r>
+            <w:r>
+              <w:rPr>
+                <w:noProof/>
+                <w:webHidden/>
+              </w:rPr>
+            </w:r>
+            <w:r>
+              <w:rPr>
+                <w:noProof/>
+                <w:webHidden/>
+              </w:rPr>
               <w:fldChar w:fldCharType="separate"/>
+            </w:r>
+            <w:r>
+              <w:rPr>
+                <w:noProof/>
+                <w:webHidden/>
+              </w:rPr>
               <w:t>7</w:t>
+            </w:r>
+            <w:r>
+              <w:rPr>
+                <w:noProof/>
+                <w:webHidden/>
+              </w:rPr>
               <w:fldChar w:fldCharType="end"/>
             </w:r>
           </w:hyperlink>
@@ -1689,7 +2139,7 @@
               <w14:ligatures w14:val="standardContextual"/>
             </w:rPr>
           </w:pPr>
-          <w:hyperlink w:anchor="_Toc241399985" w:history="1">
+          <w:hyperlink w:anchor="_Toc241585809" w:history="1">
             <w:r>
               <w:rPr>
                 <w:rStyle w:val="Hyperlink"/>
@@ -1701,10 +2151,40 @@
                 <w:webHidden/>
               </w:rPr>
               <w:tab/>
+            </w:r>
+            <w:r>
+              <w:rPr>
+                <w:webHidden/>
+              </w:rPr>
               <w:fldChar w:fldCharType="begin"/>
-              <w:instrText xml:space="preserve"> PAGEREF _Toc241399985 \h </w:instrText>
+            </w:r>
+            <w:r>
+              <w:rPr>
+                <w:webHidden/>
+              </w:rPr>
+              <w:instrText xml:space="preserve"> PAGEREF _Toc241585809 \h </w:instrText>
+            </w:r>
+            <w:r>
+              <w:rPr>
+                <w:webHidden/>
+              </w:rPr>
+            </w:r>
+            <w:r>
+              <w:rPr>
+                <w:webHidden/>
+              </w:rPr>
               <w:fldChar w:fldCharType="separate"/>
+            </w:r>
+            <w:r>
+              <w:rPr>
+                <w:webHidden/>
+              </w:rPr>
               <w:t>7</w:t>
+            </w:r>
+            <w:r>
+              <w:rPr>
+                <w:webHidden/>
+              </w:rPr>
               <w:fldChar w:fldCharType="end"/>
             </w:r>
           </w:hyperlink>
@@ -1721,7 +2201,7 @@
               <w14:ligatures w14:val="standardContextual"/>
             </w:rPr>
           </w:pPr>
-          <w:hyperlink w:anchor="_Toc241399986" w:history="1">
+          <w:hyperlink w:anchor="_Toc241585810" w:history="1">
             <w:r>
               <w:rPr>
                 <w:rStyle w:val="Hyperlink"/>
@@ -1733,10 +2213,40 @@
                 <w:webHidden/>
               </w:rPr>
               <w:tab/>
+            </w:r>
+            <w:r>
+              <w:rPr>
+                <w:webHidden/>
+              </w:rPr>
               <w:fldChar w:fldCharType="begin"/>
-              <w:instrText xml:space="preserve"> PAGEREF _Toc241399986 \h </w:instrText>
+            </w:r>
+            <w:r>
+              <w:rPr>
+                <w:webHidden/>
+              </w:rPr>
+              <w:instrText xml:space="preserve"> PAGEREF _Toc241585810 \h </w:instrText>
+            </w:r>
+            <w:r>
+              <w:rPr>
+                <w:webHidden/>
+              </w:rPr>
+            </w:r>
+            <w:r>
+              <w:rPr>
+                <w:webHidden/>
+              </w:rPr>
               <w:fldChar w:fldCharType="separate"/>
+            </w:r>
+            <w:r>
+              <w:rPr>
+                <w:webHidden/>
+              </w:rPr>
               <w:t>8</w:t>
+            </w:r>
+            <w:r>
+              <w:rPr>
+                <w:webHidden/>
+              </w:rPr>
               <w:fldChar w:fldCharType="end"/>
             </w:r>
           </w:hyperlink>
@@ -1758,7 +2268,7 @@
               <w14:ligatures w14:val="standardContextual"/>
             </w:rPr>
           </w:pPr>
-          <w:hyperlink w:anchor="_Toc241399987" w:history="1">
+          <w:hyperlink w:anchor="_Toc241585811" w:history="1">
             <w:r>
               <w:rPr>
                 <w:rStyle w:val="Hyperlink"/>
@@ -1773,10 +2283,46 @@
                 <w:webHidden/>
               </w:rPr>
               <w:tab/>
+            </w:r>
+            <w:r>
+              <w:rPr>
+                <w:noProof/>
+                <w:webHidden/>
+              </w:rPr>
               <w:fldChar w:fldCharType="begin"/>
-              <w:instrText xml:space="preserve"> PAGEREF _Toc241399987 \h </w:instrText>
+            </w:r>
+            <w:r>
+              <w:rPr>
+                <w:noProof/>
+                <w:webHidden/>
+              </w:rPr>
+              <w:instrText xml:space="preserve"> PAGEREF _Toc241585811 \h </w:instrText>
+            </w:r>
+            <w:r>
+              <w:rPr>
+                <w:noProof/>
+                <w:webHidden/>
+              </w:rPr>
+            </w:r>
+            <w:r>
+              <w:rPr>
+                <w:noProof/>
+                <w:webHidden/>
+              </w:rPr>
               <w:fldChar w:fldCharType="separate"/>
+            </w:r>
+            <w:r>
+              <w:rPr>
+                <w:noProof/>
+                <w:webHidden/>
+              </w:rPr>
               <w:t>8</w:t>
+            </w:r>
+            <w:r>
+              <w:rPr>
+                <w:noProof/>
+                <w:webHidden/>
+              </w:rPr>
               <w:fldChar w:fldCharType="end"/>
             </w:r>
           </w:hyperlink>
@@ -1798,7 +2344,7 @@
               <w14:ligatures w14:val="standardContextual"/>
             </w:rPr>
           </w:pPr>
-          <w:hyperlink w:anchor="_Toc241399988" w:history="1">
+          <w:hyperlink w:anchor="_Toc241585812" w:history="1">
             <w:r>
               <w:rPr>
                 <w:rStyle w:val="Hyperlink"/>
@@ -1813,10 +2359,46 @@
                 <w:webHidden/>
               </w:rPr>
               <w:tab/>
+            </w:r>
+            <w:r>
+              <w:rPr>
+                <w:noProof/>
+                <w:webHidden/>
+              </w:rPr>
               <w:fldChar w:fldCharType="begin"/>
-              <w:instrText xml:space="preserve"> PAGEREF _Toc241399988 \h </w:instrText>
+            </w:r>
+            <w:r>
+              <w:rPr>
+                <w:noProof/>
+                <w:webHidden/>
+              </w:rPr>
+              <w:instrText xml:space="preserve"> PAGEREF _Toc241585812 \h </w:instrText>
+            </w:r>
+            <w:r>
+              <w:rPr>
+                <w:noProof/>
+                <w:webHidden/>
+              </w:rPr>
+            </w:r>
+            <w:r>
+              <w:rPr>
+                <w:noProof/>
+                <w:webHidden/>
+              </w:rPr>
               <w:fldChar w:fldCharType="separate"/>
+            </w:r>
+            <w:r>
+              <w:rPr>
+                <w:noProof/>
+                <w:webHidden/>
+              </w:rPr>
               <w:t>9</w:t>
+            </w:r>
+            <w:r>
+              <w:rPr>
+                <w:noProof/>
+                <w:webHidden/>
+              </w:rPr>
               <w:fldChar w:fldCharType="end"/>
             </w:r>
           </w:hyperlink>
@@ -1838,7 +2420,7 @@
               <w14:ligatures w14:val="standardContextual"/>
             </w:rPr>
           </w:pPr>
-          <w:hyperlink w:anchor="_Toc241399989" w:history="1">
+          <w:hyperlink w:anchor="_Toc241585813" w:history="1">
             <w:r>
               <w:rPr>
                 <w:rStyle w:val="Hyperlink"/>
@@ -1853,10 +2435,46 @@
                 <w:webHidden/>
               </w:rPr>
               <w:tab/>
+            </w:r>
+            <w:r>
+              <w:rPr>
+                <w:noProof/>
+                <w:webHidden/>
+              </w:rPr>
               <w:fldChar w:fldCharType="begin"/>
-              <w:instrText xml:space="preserve"> PAGEREF _Toc241399989 \h </w:instrText>
+            </w:r>
+            <w:r>
+              <w:rPr>
+                <w:noProof/>
+                <w:webHidden/>
+              </w:rPr>
+              <w:instrText xml:space="preserve"> PAGEREF _Toc241585813 \h </w:instrText>
+            </w:r>
+            <w:r>
+              <w:rPr>
+                <w:noProof/>
+                <w:webHidden/>
+              </w:rPr>
+            </w:r>
+            <w:r>
+              <w:rPr>
+                <w:noProof/>
+                <w:webHidden/>
+              </w:rPr>
               <w:fldChar w:fldCharType="separate"/>
+            </w:r>
+            <w:r>
+              <w:rPr>
+                <w:noProof/>
+                <w:webHidden/>
+              </w:rPr>
               <w:t>9</w:t>
+            </w:r>
+            <w:r>
+              <w:rPr>
+                <w:noProof/>
+                <w:webHidden/>
+              </w:rPr>
               <w:fldChar w:fldCharType="end"/>
             </w:r>
           </w:hyperlink>
@@ -1873,7 +2491,7 @@
               <w14:ligatures w14:val="standardContextual"/>
             </w:rPr>
           </w:pPr>
-          <w:hyperlink w:anchor="_Toc241399990" w:history="1">
+          <w:hyperlink w:anchor="_Toc241585814" w:history="1">
             <w:r>
               <w:rPr>
                 <w:rStyle w:val="Hyperlink"/>
@@ -1885,10 +2503,40 @@
                 <w:webHidden/>
               </w:rPr>
               <w:tab/>
+            </w:r>
+            <w:r>
+              <w:rPr>
+                <w:webHidden/>
+              </w:rPr>
               <w:fldChar w:fldCharType="begin"/>
-              <w:instrText xml:space="preserve"> PAGEREF _Toc241399990 \h </w:instrText>
+            </w:r>
+            <w:r>
+              <w:rPr>
+                <w:webHidden/>
+              </w:rPr>
+              <w:instrText xml:space="preserve"> PAGEREF _Toc241585814 \h </w:instrText>
+            </w:r>
+            <w:r>
+              <w:rPr>
+                <w:webHidden/>
+              </w:rPr>
+            </w:r>
+            <w:r>
+              <w:rPr>
+                <w:webHidden/>
+              </w:rPr>
               <w:fldChar w:fldCharType="separate"/>
+            </w:r>
+            <w:r>
+              <w:rPr>
+                <w:webHidden/>
+              </w:rPr>
               <w:t>10</w:t>
+            </w:r>
+            <w:r>
+              <w:rPr>
+                <w:webHidden/>
+              </w:rPr>
               <w:fldChar w:fldCharType="end"/>
             </w:r>
           </w:hyperlink>
@@ -1910,7 +2558,7 @@
               <w14:ligatures w14:val="standardContextual"/>
             </w:rPr>
           </w:pPr>
-          <w:hyperlink w:anchor="_Toc241399991" w:history="1">
+          <w:hyperlink w:anchor="_Toc241585815" w:history="1">
             <w:r>
               <w:rPr>
                 <w:rStyle w:val="Hyperlink"/>
@@ -1925,10 +2573,46 @@
                 <w:webHidden/>
               </w:rPr>
               <w:tab/>
+            </w:r>
+            <w:r>
+              <w:rPr>
+                <w:noProof/>
+                <w:webHidden/>
+              </w:rPr>
               <w:fldChar w:fldCharType="begin"/>
-              <w:instrText xml:space="preserve"> PAGEREF _Toc241399991 \h </w:instrText>
+            </w:r>
+            <w:r>
+              <w:rPr>
+                <w:noProof/>
+                <w:webHidden/>
+              </w:rPr>
+              <w:instrText xml:space="preserve"> PAGEREF _Toc241585815 \h </w:instrText>
+            </w:r>
+            <w:r>
+              <w:rPr>
+                <w:noProof/>
+                <w:webHidden/>
+              </w:rPr>
+            </w:r>
+            <w:r>
+              <w:rPr>
+                <w:noProof/>
+                <w:webHidden/>
+              </w:rPr>
               <w:fldChar w:fldCharType="separate"/>
+            </w:r>
+            <w:r>
+              <w:rPr>
+                <w:noProof/>
+                <w:webHidden/>
+              </w:rPr>
               <w:t>10</w:t>
+            </w:r>
+            <w:r>
+              <w:rPr>
+                <w:noProof/>
+                <w:webHidden/>
+              </w:rPr>
               <w:fldChar w:fldCharType="end"/>
             </w:r>
           </w:hyperlink>
@@ -1950,7 +2634,7 @@
               <w14:ligatures w14:val="standardContextual"/>
             </w:rPr>
           </w:pPr>
-          <w:hyperlink w:anchor="_Toc241399992" w:history="1">
+          <w:hyperlink w:anchor="_Toc241585816" w:history="1">
             <w:r>
               <w:rPr>
                 <w:rStyle w:val="Hyperlink"/>
@@ -1965,10 +2649,46 @@
                 <w:webHidden/>
               </w:rPr>
               <w:tab/>
+            </w:r>
+            <w:r>
+              <w:rPr>
+                <w:noProof/>
+                <w:webHidden/>
+              </w:rPr>
               <w:fldChar w:fldCharType="begin"/>
-              <w:instrText xml:space="preserve"> PAGEREF _Toc241399992 \h </w:instrText>
+            </w:r>
+            <w:r>
+              <w:rPr>
+                <w:noProof/>
+                <w:webHidden/>
+              </w:rPr>
+              <w:instrText xml:space="preserve"> PAGEREF _Toc241585816 \h </w:instrText>
+            </w:r>
+            <w:r>
+              <w:rPr>
+                <w:noProof/>
+                <w:webHidden/>
+              </w:rPr>
+            </w:r>
+            <w:r>
+              <w:rPr>
+                <w:noProof/>
+                <w:webHidden/>
+              </w:rPr>
               <w:fldChar w:fldCharType="separate"/>
+            </w:r>
+            <w:r>
+              <w:rPr>
+                <w:noProof/>
+                <w:webHidden/>
+              </w:rPr>
               <w:t>10</w:t>
+            </w:r>
+            <w:r>
+              <w:rPr>
+                <w:noProof/>
+                <w:webHidden/>
+              </w:rPr>
               <w:fldChar w:fldCharType="end"/>
             </w:r>
           </w:hyperlink>
@@ -1990,7 +2710,7 @@
               <w14:ligatures w14:val="standardContextual"/>
             </w:rPr>
           </w:pPr>
-          <w:hyperlink w:anchor="_Toc241399993" w:history="1">
+          <w:hyperlink w:anchor="_Toc241585817" w:history="1">
             <w:r>
               <w:rPr>
                 <w:rStyle w:val="Hyperlink"/>
@@ -2005,10 +2725,46 @@
                 <w:webHidden/>
               </w:rPr>
               <w:tab/>
+            </w:r>
+            <w:r>
+              <w:rPr>
+                <w:noProof/>
+                <w:webHidden/>
+              </w:rPr>
               <w:fldChar w:fldCharType="begin"/>
-              <w:instrText xml:space="preserve"> PAGEREF _Toc241399993 \h </w:instrText>
+            </w:r>
+            <w:r>
+              <w:rPr>
+                <w:noProof/>
+                <w:webHidden/>
+              </w:rPr>
+              <w:instrText xml:space="preserve"> PAGEREF _Toc241585817 \h </w:instrText>
+            </w:r>
+            <w:r>
+              <w:rPr>
+                <w:noProof/>
+                <w:webHidden/>
+              </w:rPr>
+            </w:r>
+            <w:r>
+              <w:rPr>
+                <w:noProof/>
+                <w:webHidden/>
+              </w:rPr>
               <w:fldChar w:fldCharType="separate"/>
+            </w:r>
+            <w:r>
+              <w:rPr>
+                <w:noProof/>
+                <w:webHidden/>
+              </w:rPr>
               <w:t>10</w:t>
+            </w:r>
+            <w:r>
+              <w:rPr>
+                <w:noProof/>
+                <w:webHidden/>
+              </w:rPr>
               <w:fldChar w:fldCharType="end"/>
             </w:r>
           </w:hyperlink>
@@ -2030,7 +2786,7 @@
               <w14:ligatures w14:val="standardContextual"/>
             </w:rPr>
           </w:pPr>
-          <w:hyperlink w:anchor="_Toc241399994" w:history="1">
+          <w:hyperlink w:anchor="_Toc241585818" w:history="1">
             <w:r>
               <w:rPr>
                 <w:rStyle w:val="Hyperlink"/>
@@ -2045,44 +2801,46 @@
                 <w:webHidden/>
               </w:rPr>
               <w:tab/>
+            </w:r>
+            <w:r>
+              <w:rPr>
+                <w:noProof/>
+                <w:webHidden/>
+              </w:rPr>
               <w:fldChar w:fldCharType="begin"/>
-              <w:instrText xml:space="preserve"> PAGEREF _Toc241399994 \h </w:instrText>
+            </w:r>
+            <w:r>
+              <w:rPr>
+                <w:noProof/>
+                <w:webHidden/>
+              </w:rPr>
+              <w:instrText xml:space="preserve"> PAGEREF _Toc241585818 \h </w:instrText>
+            </w:r>
+            <w:r>
+              <w:rPr>
+                <w:noProof/>
+                <w:webHidden/>
+              </w:rPr>
+            </w:r>
+            <w:r>
+              <w:rPr>
+                <w:noProof/>
+                <w:webHidden/>
+              </w:rPr>
               <w:fldChar w:fldCharType="separate"/>
+            </w:r>
+            <w:r>
+              <w:rPr>
+                <w:noProof/>
+                <w:webHidden/>
+              </w:rPr>
               <w:t>11</w:t>
-              <w:fldChar w:fldCharType="end"/>
-            </w:r>
-          </w:hyperlink>
-        </w:p>
-        <w:p>
-          <w:pPr>
-            <w:pStyle w:val="TOC2"/>
-            <w:tabs>
-              <w:tab w:val="right" w:leader="dot" w:pos="9926"/>
-            </w:tabs>
-            <w:rPr>
-              <w:b w:val="0"/>
-              <w:bCs w:val="0"/>
-              <w:noProof/>
-            </w:rPr>
-          </w:pPr>
-          <w:hyperlink w:anchor="_Toc241399995c" w:history="1">
-            <w:r>
-              <w:rPr>
-                <w:rStyle w:val="Hyperlink"/>
-                <w:rFonts w:ascii="Times New Roman" w:hAnsi="Times New Roman" w:cs="Times New Roman"/>
+            </w:r>
+            <w:r>
+              <w:rPr>
                 <w:noProof/>
-              </w:rPr>
-              <w:t>5.5 Current Implementation Status</w:t>
-            </w:r>
-            <w:r>
-              <w:rPr>
-                <w:noProof/>
-              </w:rPr>
-              <w:tab/>
-              <w:fldChar w:fldCharType="begin"/>
-              <w:instrText xml:space="preserve"> PAGEREF _Toc241399995c \h </w:instrText>
-              <w:fldChar w:fldCharType="separate"/>
-              <w:t>12</w:t>
+                <w:webHidden/>
+              </w:rPr>
               <w:fldChar w:fldCharType="end"/>
             </w:r>
           </w:hyperlink>
@@ -2104,7 +2862,7 @@
               <w14:ligatures w14:val="standardContextual"/>
             </w:rPr>
           </w:pPr>
-          <w:hyperlink w:anchor="_Toc241399995" w:history="1">
+          <w:hyperlink w:anchor="_Toc241585819" w:history="1">
             <w:r>
               <w:rPr>
                 <w:rStyle w:val="Hyperlink"/>
@@ -2119,10 +2877,46 @@
                 <w:webHidden/>
               </w:rPr>
               <w:tab/>
+            </w:r>
+            <w:r>
+              <w:rPr>
+                <w:noProof/>
+                <w:webHidden/>
+              </w:rPr>
               <w:fldChar w:fldCharType="begin"/>
-              <w:instrText xml:space="preserve"> PAGEREF _Toc241399995 \h </w:instrText>
+            </w:r>
+            <w:r>
+              <w:rPr>
+                <w:noProof/>
+                <w:webHidden/>
+              </w:rPr>
+              <w:instrText xml:space="preserve"> PAGEREF _Toc241585819 \h </w:instrText>
+            </w:r>
+            <w:r>
+              <w:rPr>
+                <w:noProof/>
+                <w:webHidden/>
+              </w:rPr>
+            </w:r>
+            <w:r>
+              <w:rPr>
+                <w:noProof/>
+                <w:webHidden/>
+              </w:rPr>
               <w:fldChar w:fldCharType="separate"/>
+            </w:r>
+            <w:r>
+              <w:rPr>
+                <w:noProof/>
+                <w:webHidden/>
+              </w:rPr>
               <w:t>11</w:t>
+            </w:r>
+            <w:r>
+              <w:rPr>
+                <w:noProof/>
+                <w:webHidden/>
+              </w:rPr>
               <w:fldChar w:fldCharType="end"/>
             </w:r>
           </w:hyperlink>
@@ -2144,7 +2938,7 @@
               <w14:ligatures w14:val="standardContextual"/>
             </w:rPr>
           </w:pPr>
-          <w:hyperlink w:anchor="_Toc241399996" w:history="1">
+          <w:hyperlink w:anchor="_Toc241585820" w:history="1">
             <w:r>
               <w:rPr>
                 <w:rStyle w:val="Hyperlink"/>
@@ -2159,10 +2953,46 @@
                 <w:webHidden/>
               </w:rPr>
               <w:tab/>
+            </w:r>
+            <w:r>
+              <w:rPr>
+                <w:noProof/>
+                <w:webHidden/>
+              </w:rPr>
               <w:fldChar w:fldCharType="begin"/>
-              <w:instrText xml:space="preserve"> PAGEREF _Toc241399996 \h </w:instrText>
+            </w:r>
+            <w:r>
+              <w:rPr>
+                <w:noProof/>
+                <w:webHidden/>
+              </w:rPr>
+              <w:instrText xml:space="preserve"> PAGEREF _Toc241585820 \h </w:instrText>
+            </w:r>
+            <w:r>
+              <w:rPr>
+                <w:noProof/>
+                <w:webHidden/>
+              </w:rPr>
+            </w:r>
+            <w:r>
+              <w:rPr>
+                <w:noProof/>
+                <w:webHidden/>
+              </w:rPr>
               <w:fldChar w:fldCharType="separate"/>
-              <w:t>11</w:t>
+            </w:r>
+            <w:r>
+              <w:rPr>
+                <w:noProof/>
+                <w:webHidden/>
+              </w:rPr>
+              <w:t>12</w:t>
+            </w:r>
+            <w:r>
+              <w:rPr>
+                <w:noProof/>
+                <w:webHidden/>
+              </w:rPr>
               <w:fldChar w:fldCharType="end"/>
             </w:r>
           </w:hyperlink>
@@ -2184,7 +3014,7 @@
               <w14:ligatures w14:val="standardContextual"/>
             </w:rPr>
           </w:pPr>
-          <w:hyperlink w:anchor="_Toc241399997" w:history="1">
+          <w:hyperlink w:anchor="_Toc241585821" w:history="1">
             <w:r>
               <w:rPr>
                 <w:rStyle w:val="Hyperlink"/>
@@ -2199,10 +3029,46 @@
                 <w:webHidden/>
               </w:rPr>
               <w:tab/>
+            </w:r>
+            <w:r>
+              <w:rPr>
+                <w:noProof/>
+                <w:webHidden/>
+              </w:rPr>
               <w:fldChar w:fldCharType="begin"/>
-              <w:instrText xml:space="preserve"> PAGEREF _Toc241399997 \h </w:instrText>
+            </w:r>
+            <w:r>
+              <w:rPr>
+                <w:noProof/>
+                <w:webHidden/>
+              </w:rPr>
+              <w:instrText xml:space="preserve"> PAGEREF _Toc241585821 \h </w:instrText>
+            </w:r>
+            <w:r>
+              <w:rPr>
+                <w:noProof/>
+                <w:webHidden/>
+              </w:rPr>
+            </w:r>
+            <w:r>
+              <w:rPr>
+                <w:noProof/>
+                <w:webHidden/>
+              </w:rPr>
               <w:fldChar w:fldCharType="separate"/>
+            </w:r>
+            <w:r>
+              <w:rPr>
+                <w:noProof/>
+                <w:webHidden/>
+              </w:rPr>
               <w:t>12</w:t>
+            </w:r>
+            <w:r>
+              <w:rPr>
+                <w:noProof/>
+                <w:webHidden/>
+              </w:rPr>
               <w:fldChar w:fldCharType="end"/>
             </w:r>
           </w:hyperlink>
@@ -2269,11 +3135,12 @@
           <w:rFonts w:ascii="Times New Roman" w:hAnsi="Times New Roman" w:cs="Times New Roman"/>
         </w:rPr>
       </w:pPr>
-      <w:bookmarkStart w:id="2" w:name="_Toc241399977"/>
+      <w:bookmarkStart w:id="2" w:name="_Toc241585801"/>
       <w:r>
         <w:rPr>
           <w:rFonts w:ascii="Times New Roman" w:hAnsi="Times New Roman" w:cs="Times New Roman"/>
         </w:rPr>
+        <w:lastRenderedPageBreak/>
         <w:t>1. INTRODUCTION</w:t>
       </w:r>
       <w:bookmarkEnd w:id="2"/>
@@ -2312,7 +3179,7 @@
           <w:rFonts w:ascii="Times New Roman" w:hAnsi="Times New Roman" w:cs="Times New Roman"/>
         </w:rPr>
       </w:pPr>
-      <w:bookmarkStart w:id="3" w:name="_Toc241399978"/>
+      <w:bookmarkStart w:id="3" w:name="_Toc241585802"/>
       <w:r>
         <w:rPr>
           <w:rFonts w:ascii="Times New Roman" w:hAnsi="Times New Roman" w:cs="Times New Roman"/>
@@ -2611,7 +3478,7 @@
           <w:rFonts w:ascii="Times New Roman" w:hAnsi="Times New Roman" w:cs="Times New Roman"/>
         </w:rPr>
       </w:pPr>
-      <w:bookmarkStart w:id="4" w:name="_Toc241399979"/>
+      <w:bookmarkStart w:id="4" w:name="_Toc241585803"/>
       <w:r>
         <w:rPr>
           <w:rFonts w:ascii="Times New Roman" w:hAnsi="Times New Roman" w:cs="Times New Roman"/>
@@ -2664,11 +3531,12 @@
           <w:rFonts w:ascii="Times New Roman" w:hAnsi="Times New Roman" w:cs="Times New Roman"/>
         </w:rPr>
       </w:pPr>
-      <w:bookmarkStart w:id="5" w:name="_Toc241399980"/>
+      <w:bookmarkStart w:id="5" w:name="_Toc241585804"/>
       <w:r>
         <w:rPr>
           <w:rFonts w:ascii="Times New Roman" w:hAnsi="Times New Roman" w:cs="Times New Roman"/>
         </w:rPr>
+        <w:lastRenderedPageBreak/>
         <w:t>2. OBJECTIVE</w:t>
       </w:r>
       <w:bookmarkEnd w:id="5"/>
@@ -2688,7 +3556,7 @@
           <w:rFonts w:ascii="Times New Roman" w:hAnsi="Times New Roman" w:cs="Times New Roman"/>
         </w:rPr>
       </w:pPr>
-      <w:bookmarkStart w:id="6" w:name="_Toc241399981"/>
+      <w:bookmarkStart w:id="6" w:name="_Toc241585805"/>
       <w:r>
         <w:rPr>
           <w:rFonts w:ascii="Times New Roman" w:hAnsi="Times New Roman" w:cs="Times New Roman"/>
@@ -2733,7 +3601,7 @@
           <w:rFonts w:ascii="Times New Roman" w:hAnsi="Times New Roman" w:cs="Times New Roman"/>
         </w:rPr>
       </w:pPr>
-      <w:bookmarkStart w:id="7" w:name="_Toc241399982"/>
+      <w:bookmarkStart w:id="7" w:name="_Toc241585806"/>
       <w:r>
         <w:rPr>
           <w:rFonts w:ascii="Times New Roman" w:hAnsi="Times New Roman" w:cs="Times New Roman"/>
@@ -2896,12 +3764,12 @@
           <w:rFonts w:ascii="Times New Roman" w:hAnsi="Times New Roman" w:cs="Times New Roman"/>
         </w:rPr>
       </w:pPr>
-      <w:bookmarkStart w:id="8" w:name="_Toc241399983"/>
+      <w:bookmarkStart w:id="8" w:name="_Toc241585807"/>
       <w:r>
         <w:rPr>
           <w:rFonts w:ascii="Times New Roman" w:hAnsi="Times New Roman" w:cs="Times New Roman"/>
         </w:rPr>
-        <w:t xml:space="preserve">2.3 Success Metrics and Expected Evidence</w:t>
+        <w:t>2.3 Success Metrics and Expected Evidence</w:t>
       </w:r>
       <w:bookmarkEnd w:id="8"/>
     </w:p>
@@ -2921,7 +3789,7 @@
           <w:sz w:val="20"/>
           <w:szCs w:val="20"/>
         </w:rPr>
-        <w:t xml:space="preserve">Table 2: Success Metrics and Expected Evidence</w:t>
+        <w:t>Table 2: Success Metrics and Expected Evidence</w:t>
       </w:r>
     </w:p>
     <w:tbl>
@@ -3252,7 +4120,7 @@
           <w:rFonts w:ascii="Times New Roman" w:hAnsi="Times New Roman" w:cs="Times New Roman"/>
         </w:rPr>
       </w:pPr>
-      <w:bookmarkStart w:id="9" w:name="_Toc241399984"/>
+      <w:bookmarkStart w:id="9" w:name="_Toc241585808"/>
       <w:r>
         <w:rPr>
           <w:rFonts w:ascii="Times New Roman" w:hAnsi="Times New Roman" w:cs="Times New Roman"/>
@@ -3297,7 +4165,7 @@
           <w:rFonts w:ascii="Times New Roman" w:hAnsi="Times New Roman" w:cs="Times New Roman"/>
         </w:rPr>
       </w:pPr>
-      <w:bookmarkStart w:id="10" w:name="_Toc241399985"/>
+      <w:bookmarkStart w:id="10" w:name="_Toc241585809"/>
       <w:r>
         <w:rPr>
           <w:rFonts w:ascii="Times New Roman" w:hAnsi="Times New Roman" w:cs="Times New Roman"/>
@@ -4008,6 +4876,7 @@
           <w:rFonts w:cs="Times New Roman"/>
           <w:noProof/>
         </w:rPr>
+        <w:lastRenderedPageBreak/>
         <w:drawing>
           <wp:inline distT="0" distB="0" distL="0" distR="0" wp14:anchorId="2A413849" wp14:editId="231901EB">
             <wp:extent cx="6308090" cy="3755273"/>
@@ -4134,7 +5003,7 @@
           <w:rFonts w:ascii="Times New Roman" w:hAnsi="Times New Roman" w:cs="Times New Roman"/>
         </w:rPr>
       </w:pPr>
-      <w:bookmarkStart w:id="11" w:name="_Toc241399986"/>
+      <w:bookmarkStart w:id="11" w:name="_Toc241585810"/>
       <w:r>
         <w:rPr>
           <w:rFonts w:ascii="Times New Roman" w:hAnsi="Times New Roman" w:cs="Times New Roman"/>
@@ -4152,7 +5021,7 @@
           <w:rFonts w:ascii="Times New Roman" w:hAnsi="Times New Roman" w:cs="Times New Roman"/>
         </w:rPr>
       </w:pPr>
-      <w:bookmarkStart w:id="12" w:name="_Toc241399987"/>
+      <w:bookmarkStart w:id="12" w:name="_Toc241585811"/>
       <w:r>
         <w:rPr>
           <w:rFonts w:ascii="Times New Roman" w:hAnsi="Times New Roman" w:cs="Times New Roman"/>
@@ -4278,6 +5147,7 @@
           <w:sz w:val="24"/>
           <w:szCs w:val="28"/>
         </w:rPr>
+        <w:lastRenderedPageBreak/>
         <w:t>The candidate signs in and submits a resume, target job description, and optional context.</w:t>
       </w:r>
     </w:p>
@@ -4361,7 +5231,7 @@
           <w:rFonts w:ascii="Times New Roman" w:hAnsi="Times New Roman" w:cs="Times New Roman"/>
         </w:rPr>
       </w:pPr>
-      <w:bookmarkStart w:id="13" w:name="_Toc241399988"/>
+      <w:bookmarkStart w:id="13" w:name="_Toc241585812"/>
       <w:r>
         <w:rPr>
           <w:rFonts w:ascii="Times New Roman" w:hAnsi="Times New Roman" w:cs="Times New Roman"/>
@@ -4409,7 +5279,7 @@
           <w:rFonts w:ascii="Times New Roman" w:hAnsi="Times New Roman" w:cs="Times New Roman"/>
         </w:rPr>
       </w:pPr>
-      <w:bookmarkStart w:id="14" w:name="_Toc241399989"/>
+      <w:bookmarkStart w:id="14" w:name="_Toc241585813"/>
       <w:r>
         <w:rPr>
           <w:rFonts w:ascii="Times New Roman" w:hAnsi="Times New Roman" w:cs="Times New Roman"/>
@@ -4902,7 +5772,7 @@
           <w:rFonts w:ascii="Times New Roman" w:hAnsi="Times New Roman" w:cs="Times New Roman"/>
         </w:rPr>
       </w:pPr>
-      <w:bookmarkStart w:id="15" w:name="_Toc241399990"/>
+      <w:bookmarkStart w:id="15" w:name="_Toc241585814"/>
       <w:r>
         <w:rPr>
           <w:rFonts w:ascii="Times New Roman" w:hAnsi="Times New Roman" w:cs="Times New Roman"/>
@@ -4920,7 +5790,7 @@
           <w:rFonts w:ascii="Times New Roman" w:hAnsi="Times New Roman" w:cs="Times New Roman"/>
         </w:rPr>
       </w:pPr>
-      <w:bookmarkStart w:id="16" w:name="_Toc241399991"/>
+      <w:bookmarkStart w:id="16" w:name="_Toc241585815"/>
       <w:r>
         <w:rPr>
           <w:rFonts w:ascii="Times New Roman" w:hAnsi="Times New Roman" w:cs="Times New Roman"/>
@@ -4967,9 +5837,9 @@
         <w:tblLook w:val="04A0" w:firstRow="1" w:lastRow="0" w:firstColumn="1" w:lastColumn="0" w:noHBand="0" w:noVBand="1"/>
       </w:tblPr>
       <w:tblGrid>
-        <w:gridCol w:w="3299"/>
-        <w:gridCol w:w="3317"/>
-        <w:gridCol w:w="3304"/>
+        <w:gridCol w:w="3303"/>
+        <w:gridCol w:w="3314"/>
+        <w:gridCol w:w="3303"/>
       </w:tblGrid>
       <w:tr>
         <w:trPr>
@@ -5746,7 +6616,7 @@
           <w:rFonts w:ascii="Times New Roman" w:hAnsi="Times New Roman" w:cs="Times New Roman"/>
         </w:rPr>
       </w:pPr>
-      <w:bookmarkStart w:id="17" w:name="_Toc241399992"/>
+      <w:bookmarkStart w:id="17" w:name="_Toc241585816"/>
       <w:r>
         <w:rPr>
           <w:rFonts w:ascii="Times New Roman" w:hAnsi="Times New Roman" w:cs="Times New Roman"/>
@@ -6047,7 +6917,7 @@
           <w:rFonts w:ascii="Times New Roman" w:hAnsi="Times New Roman" w:cs="Times New Roman"/>
         </w:rPr>
       </w:pPr>
-      <w:bookmarkStart w:id="18" w:name="_Toc241399993"/>
+      <w:bookmarkStart w:id="18" w:name="_Toc241585817"/>
       <w:r>
         <w:rPr>
           <w:rFonts w:ascii="Times New Roman" w:hAnsi="Times New Roman" w:cs="Times New Roman"/>
@@ -6057,6 +6927,7 @@
       <w:bookmarkEnd w:id="18"/>
     </w:p>
     <w:p/>
+    <w:p/>
     <w:p>
       <w:pPr>
         <w:jc w:val="center"/>
@@ -6072,6 +6943,7 @@
           <w:sz w:val="20"/>
           <w:szCs w:val="24"/>
         </w:rPr>
+        <w:lastRenderedPageBreak/>
         <w:t>Table 7: Software requirement/specification</w:t>
       </w:r>
     </w:p>
@@ -6389,7 +7261,7 @@
           <w:rFonts w:ascii="Times New Roman" w:hAnsi="Times New Roman" w:cs="Times New Roman"/>
         </w:rPr>
       </w:pPr>
-      <w:bookmarkStart w:id="19" w:name="_Toc241399994"/>
+      <w:bookmarkStart w:id="19" w:name="_Toc241585818"/>
       <w:r>
         <w:rPr>
           <w:rFonts w:ascii="Times New Roman" w:hAnsi="Times New Roman" w:cs="Times New Roman"/>
@@ -6417,6 +7289,219 @@
         <w:t>The proposed deployment will use environment-managed secrets, HTTPS, secure browser headers, allowed-origin controls, authenticated WebSocket sessions, owner-scoped access checks, daily usage quotas for high-cost analysis, and application health monitoring. A public launch will additionally require a shared work queue, distributed rate limiting, backup/recovery procedures, and provider-budget alerts.</w:t>
       </w:r>
     </w:p>
+    <w:tbl>
+      <w:tblPr>
+        <w:tblW w:w="10058" w:type="dxa"/>
+        <w:jc w:val="center"/>
+        <w:tblBorders>
+          <w:top w:val="single" w:sz="6" w:space="0" w:color="808080"/>
+          <w:left w:val="single" w:sz="6" w:space="0" w:color="808080"/>
+          <w:bottom w:val="single" w:sz="6" w:space="0" w:color="808080"/>
+          <w:right w:val="single" w:sz="6" w:space="0" w:color="808080"/>
+          <w:insideH w:val="single" w:sz="6" w:space="0" w:color="808080"/>
+          <w:insideV w:val="single" w:sz="6" w:space="0" w:color="808080"/>
+        </w:tblBorders>
+        <w:tblLook w:val="04A0" w:firstRow="1" w:lastRow="0" w:firstColumn="1" w:lastColumn="0" w:noHBand="0" w:noVBand="1"/>
+      </w:tblPr>
+      <w:tblGrid>
+        <w:gridCol w:w="4962"/>
+        <w:gridCol w:w="5096"/>
+      </w:tblGrid>
+      <w:tr>
+        <w:trPr>
+          <w:trHeight w:val="568"/>
+          <w:jc w:val="center"/>
+        </w:trPr>
+        <w:tc>
+          <w:tcPr>
+            <w:tcW w:w="4962" w:type="dxa"/>
+            <w:vAlign w:val="center"/>
+          </w:tcPr>
+          <w:p>
+            <w:pPr>
+              <w:rPr>
+                <w:rFonts w:cs="Times New Roman"/>
+                <w:sz w:val="20"/>
+                <w:szCs w:val="24"/>
+              </w:rPr>
+            </w:pPr>
+            <w:r>
+              <w:rPr>
+                <w:rFonts w:cs="Times New Roman"/>
+                <w:sz w:val="20"/>
+                <w:szCs w:val="24"/>
+              </w:rPr>
+              <w:t>Settings and provider keys</w:t>
+            </w:r>
+          </w:p>
+        </w:tc>
+        <w:tc>
+          <w:tcPr>
+            <w:tcW w:w="5096" w:type="dxa"/>
+            <w:vAlign w:val="center"/>
+          </w:tcPr>
+          <w:p>
+            <w:pPr>
+              <w:rPr>
+                <w:rFonts w:cs="Times New Roman"/>
+                <w:sz w:val="20"/>
+                <w:szCs w:val="24"/>
+              </w:rPr>
+            </w:pPr>
+            <w:r>
+              <w:rPr>
+                <w:rFonts w:cs="Times New Roman"/>
+                <w:sz w:val="20"/>
+                <w:szCs w:val="24"/>
+              </w:rPr>
+              <w:t>UI built — backend behavior not yet wired.</w:t>
+            </w:r>
+          </w:p>
+        </w:tc>
+      </w:tr>
+      <w:tr>
+        <w:trPr>
+          <w:trHeight w:val="568"/>
+          <w:jc w:val="center"/>
+        </w:trPr>
+        <w:tc>
+          <w:tcPr>
+            <w:tcW w:w="4962" w:type="dxa"/>
+            <w:vAlign w:val="center"/>
+          </w:tcPr>
+          <w:p>
+            <w:pPr>
+              <w:rPr>
+                <w:rFonts w:cs="Times New Roman"/>
+                <w:sz w:val="20"/>
+                <w:szCs w:val="24"/>
+              </w:rPr>
+            </w:pPr>
+            <w:r>
+              <w:rPr>
+                <w:rFonts w:cs="Times New Roman"/>
+                <w:sz w:val="20"/>
+                <w:szCs w:val="24"/>
+              </w:rPr>
+              <w:t>Account data rights</w:t>
+            </w:r>
+          </w:p>
+        </w:tc>
+        <w:tc>
+          <w:tcPr>
+            <w:tcW w:w="5096" w:type="dxa"/>
+            <w:vAlign w:val="center"/>
+          </w:tcPr>
+          <w:p>
+            <w:pPr>
+              <w:rPr>
+                <w:rFonts w:cs="Times New Roman"/>
+                <w:sz w:val="20"/>
+                <w:szCs w:val="24"/>
+              </w:rPr>
+            </w:pPr>
+            <w:r>
+              <w:rPr>
+                <w:rFonts w:cs="Times New Roman"/>
+                <w:sz w:val="20"/>
+                <w:szCs w:val="24"/>
+              </w:rPr>
+              <w:t>UI built — backend behavior not yet wired.</w:t>
+            </w:r>
+          </w:p>
+        </w:tc>
+      </w:tr>
+    </w:tbl>
+    <w:p>
+      <w:pPr>
+        <w:spacing w:after="120" w:line="276" w:lineRule="auto"/>
+        <w:jc w:val="both"/>
+        <w:rPr>
+          <w:rFonts w:cs="Times New Roman"/>
+          <w:sz w:val="24"/>
+          <w:szCs w:val="24"/>
+        </w:rPr>
+      </w:pPr>
+      <w:r>
+        <w:rPr>
+          <w:rFonts w:cs="Times New Roman"/>
+          <w:sz w:val="24"/>
+          <w:szCs w:val="24"/>
+        </w:rPr>
+        <w:t>The knowledge base is the one module that is partly built. Source upload and search are implemented, but retrieval quality is still being checked against real documents rather than only against test fixtures, so it is not being reported as complete.</w:t>
+      </w:r>
+    </w:p>
+    <w:p>
+      <w:pPr>
+        <w:spacing w:after="120" w:line="276" w:lineRule="auto"/>
+        <w:jc w:val="both"/>
+        <w:rPr>
+          <w:rFonts w:cs="Times New Roman"/>
+          <w:sz w:val="24"/>
+          <w:szCs w:val="24"/>
+        </w:rPr>
+      </w:pPr>
+      <w:r>
+        <w:rPr>
+          <w:rFonts w:cs="Times New Roman"/>
+          <w:sz w:val="24"/>
+          <w:szCs w:val="24"/>
+        </w:rPr>
+        <w:t>One issue is worth recording because it changes how results are trusted. The knowledge base appeared to pass its automated tests, which supplied a stubbed embedding service. When it was exercised through the running application instead, the configured embedding model had been withdrawn by its provider and every request failed. The tests had therefore confirmed the code path, not the feature. Retrieval is now being re-validated against a live provider before the module is reported as complete.</w:t>
+      </w:r>
+    </w:p>
+    <w:p>
+      <w:pPr>
+        <w:spacing w:after="120" w:line="276" w:lineRule="auto"/>
+        <w:jc w:val="both"/>
+        <w:rPr>
+          <w:rFonts w:cs="Times New Roman"/>
+          <w:sz w:val="24"/>
+          <w:szCs w:val="24"/>
+        </w:rPr>
+      </w:pPr>
+      <w:r>
+        <w:rPr>
+          <w:rFonts w:cs="Times New Roman"/>
+          <w:sz w:val="24"/>
+          <w:szCs w:val="24"/>
+        </w:rPr>
+        <w:t>The remaining planned modules, together with capacity planning, backup and recovery procedures, and evaluation with real users, form the next stage of work. Until the status above changes, none of them should be treated as available.</w:t>
+      </w:r>
+    </w:p>
+    <w:p>
+      <w:pPr>
+        <w:spacing w:after="0" w:line="360" w:lineRule="auto"/>
+        <w:jc w:val="both"/>
+        <w:rPr>
+          <w:rFonts w:cs="Times New Roman"/>
+          <w:sz w:val="36"/>
+          <w:szCs w:val="36"/>
+        </w:rPr>
+      </w:pPr>
+    </w:p>
+    <w:p>
+      <w:pPr>
+        <w:spacing w:line="360" w:lineRule="auto"/>
+        <w:rPr>
+          <w:rFonts w:cs="Times New Roman"/>
+          <w:b/>
+          <w:bCs/>
+          <w:sz w:val="28"/>
+          <w:szCs w:val="28"/>
+        </w:rPr>
+      </w:pPr>
+      <w:r>
+        <w:rPr>
+          <w:rFonts w:cs="Times New Roman"/>
+          <w:b/>
+          <w:bCs/>
+          <w:sz w:val="28"/>
+          <w:szCs w:val="28"/>
+        </w:rPr>
+        <w:t>6. EXPECTED OUTCOMES AND APPLICATION</w:t>
+      </w:r>
+    </w:p>
     <w:p>
       <w:pPr>
         <w:pStyle w:val="Heading2"/>
@@ -6425,51 +7510,156 @@
           <w:rFonts w:ascii="Times New Roman" w:hAnsi="Times New Roman" w:cs="Times New Roman"/>
         </w:rPr>
       </w:pPr>
-      <w:bookmarkStart w:id="19" w:name="_Toc241399994"/>
+      <w:bookmarkStart w:id="20" w:name="_Toc241585819"/>
       <w:r>
         <w:rPr>
           <w:rFonts w:ascii="Times New Roman" w:hAnsi="Times New Roman" w:cs="Times New Roman"/>
         </w:rPr>
-        <w:t>5.5 Current Implementation Status</w:t>
-      </w:r>
-      <w:bookmarkEnd w:id="19"/>
+        <w:t>6.1 Expected Outcomes</w:t>
+      </w:r>
+      <w:bookmarkEnd w:id="20"/>
     </w:p>
     <w:p>
       <w:pPr>
-        <w:spacing w:after="120" w:line="276" w:lineRule="auto"/>
-        <w:jc w:val="both"/>
-        <w:rPr>
-          <w:rFonts w:ascii="Times New Roman" w:hAnsi="Times New Roman" w:cs="Times New Roman"/>
+        <w:pStyle w:val="ListBullet"/>
+        <w:spacing w:line="360" w:lineRule="auto"/>
+        <w:rPr>
+          <w:sz w:val="32"/>
+          <w:szCs w:val="24"/>
+        </w:rPr>
+      </w:pPr>
+      <w:r>
+        <w:rPr>
           <w:sz w:val="24"/>
           <w:szCs w:val="24"/>
         </w:rPr>
-      </w:pPr>
-      <w:r>
-        <w:rPr>
-          <w:rFonts w:ascii="Times New Roman" w:hAnsi="Times New Roman" w:cs="Times New Roman"/>
-          <w:sz w:val="24"/>
-          <w:szCs w:val="24"/>
-        </w:rPr>
-        <w:t xml:space="preserve">Work carried out so far covers the core candidate journey, from sign-in through to a written coaching result. The remaining modules have finished interfaces, but their backend behaviour is not yet wired. The table below records the position at this stage.</w:t>
+        <w:t>A working prototype where a candidate can prepare for a target role, analyse a resume, practice an interview, and receive focused coaching.</w:t>
       </w:r>
     </w:p>
     <w:p>
       <w:pPr>
-        <w:spacing w:after="120" w:line="276" w:lineRule="auto"/>
+        <w:pStyle w:val="ListBullet"/>
+        <w:spacing w:after="40" w:line="360" w:lineRule="auto"/>
+        <w:rPr>
+          <w:rFonts w:cs="Times New Roman"/>
+          <w:sz w:val="28"/>
+          <w:szCs w:val="28"/>
+        </w:rPr>
+      </w:pPr>
+      <w:r>
+        <w:rPr>
+          <w:rFonts w:cs="Times New Roman"/>
+          <w:sz w:val="24"/>
+          <w:szCs w:val="28"/>
+        </w:rPr>
+        <w:lastRenderedPageBreak/>
+        <w:t>A Resume Analyzer that accepts PDF/DOCX files, identifies visible and missing skills, provides a directional readiness score, and prioritises the next revision.</w:t>
+      </w:r>
+    </w:p>
+    <w:p>
+      <w:pPr>
+        <w:pStyle w:val="ListBullet"/>
+        <w:spacing w:after="40" w:line="360" w:lineRule="auto"/>
+        <w:rPr>
+          <w:rFonts w:cs="Times New Roman"/>
+          <w:sz w:val="28"/>
+          <w:szCs w:val="28"/>
+        </w:rPr>
+      </w:pPr>
+      <w:r>
+        <w:rPr>
+          <w:rFonts w:cs="Times New Roman"/>
+          <w:sz w:val="24"/>
+          <w:szCs w:val="28"/>
+        </w:rPr>
+        <w:t>Secure candidate isolation through authenticated access, owner checks, Supabase row-level security, rate limits, and controlled WebSocket sessions.</w:t>
+      </w:r>
+    </w:p>
+    <w:p>
+      <w:pPr>
+        <w:pStyle w:val="ListBullet"/>
+        <w:spacing w:after="40" w:line="360" w:lineRule="auto"/>
+        <w:rPr>
+          <w:rFonts w:cs="Times New Roman"/>
+          <w:sz w:val="28"/>
+          <w:szCs w:val="28"/>
+        </w:rPr>
+      </w:pPr>
+      <w:r>
+        <w:rPr>
+          <w:rFonts w:cs="Times New Roman"/>
+          <w:sz w:val="24"/>
+          <w:szCs w:val="28"/>
+        </w:rPr>
+        <w:t>Provider fallback, request timeouts, quotas for high-cost analysis, and health monitoring to support dependable operation.</w:t>
+      </w:r>
+    </w:p>
+    <w:p>
+      <w:pPr>
+        <w:pStyle w:val="ListBullet"/>
+        <w:spacing w:after="40" w:line="360" w:lineRule="auto"/>
+        <w:rPr>
+          <w:rFonts w:cs="Times New Roman"/>
+          <w:sz w:val="28"/>
+          <w:szCs w:val="28"/>
+        </w:rPr>
+      </w:pPr>
+      <w:r>
+        <w:rPr>
+          <w:rFonts w:cs="Times New Roman"/>
+          <w:sz w:val="24"/>
+          <w:szCs w:val="28"/>
+        </w:rPr>
+        <w:t>A documented, extensible architecture suitable for future additions such as multilingual coaching, shared AI work queues, and broader candidate-approved knowledge retrieval.</w:t>
+      </w:r>
+    </w:p>
+    <w:p>
+      <w:pPr>
+        <w:pStyle w:val="ListBullet"/>
+        <w:numPr>
+          <w:ilvl w:val="0"/>
+          <w:numId w:val="0"/>
+        </w:numPr>
+        <w:spacing w:after="40" w:line="240" w:lineRule="auto"/>
+        <w:rPr>
+          <w:rFonts w:cs="Times New Roman"/>
+        </w:rPr>
+      </w:pPr>
+    </w:p>
+    <w:p>
+      <w:pPr>
+        <w:pStyle w:val="Heading2"/>
+        <w:spacing w:before="100" w:after="80"/>
+        <w:rPr>
+          <w:rFonts w:ascii="Times New Roman" w:hAnsi="Times New Roman" w:cs="Times New Roman"/>
+        </w:rPr>
+      </w:pPr>
+      <w:bookmarkStart w:id="21" w:name="_Toc241585820"/>
+      <w:r>
+        <w:rPr>
+          <w:rFonts w:ascii="Times New Roman" w:hAnsi="Times New Roman" w:cs="Times New Roman"/>
+        </w:rPr>
+        <w:t>6.2 Responsible Use and Future Readiness</w:t>
+      </w:r>
+      <w:bookmarkEnd w:id="21"/>
+    </w:p>
+    <w:p/>
+    <w:p>
+      <w:pPr>
         <w:jc w:val="center"/>
         <w:rPr>
-          <w:rFonts w:ascii="Times New Roman" w:hAnsi="Times New Roman" w:cs="Times New Roman"/>
-          <w:sz w:val="24"/>
+          <w:rFonts w:cs="Times New Roman"/>
+          <w:sz w:val="20"/>
           <w:szCs w:val="24"/>
         </w:rPr>
       </w:pPr>
       <w:r>
         <w:rPr>
-          <w:rFonts w:ascii="Times New Roman" w:hAnsi="Times New Roman" w:cs="Times New Roman"/>
-          <w:sz w:val="24"/>
+          <w:rFonts w:cs="Times New Roman"/>
+          <w:sz w:val="20"/>
           <w:szCs w:val="24"/>
         </w:rPr>
-        <w:t xml:space="preserve">Table 8: Implementation status at the current milestone</w:t>
+        <w:t>Table 9: Responsible-use design controls</w:t>
       </w:r>
     </w:p>
     <w:tbl>
@@ -6516,7 +7706,7 @@
                 <w:sz w:val="20"/>
                 <w:szCs w:val="24"/>
               </w:rPr>
-              <w:t>Module</w:t>
+              <w:t>Design control</w:t>
             </w:r>
           </w:p>
         </w:tc>
@@ -6541,7 +7731,7 @@
                 <w:sz w:val="20"/>
                 <w:szCs w:val="24"/>
               </w:rPr>
-              <w:t>Status at this milestone</w:t>
+              <w:t>Purpose</w:t>
             </w:r>
           </w:p>
         </w:tc>
@@ -6570,7 +7760,7 @@
                 <w:sz w:val="20"/>
                 <w:szCs w:val="24"/>
               </w:rPr>
-              <w:t>Prepare</w:t>
+              <w:t>Owner checks + RLS</w:t>
             </w:r>
           </w:p>
         </w:tc>
@@ -6593,7 +7783,111 @@
                 <w:sz w:val="20"/>
                 <w:szCs w:val="24"/>
               </w:rPr>
-              <w:t>Complete — resume or pasted text, job description, and optional company context produce a question pack with answer direction.</w:t>
+              <w:t>Keep each candidate's records isolated</w:t>
+            </w:r>
+          </w:p>
+        </w:tc>
+      </w:tr>
+      <w:tr>
+        <w:trPr>
+          <w:trHeight w:val="547"/>
+          <w:jc w:val="center"/>
+        </w:trPr>
+        <w:tc>
+          <w:tcPr>
+            <w:tcW w:w="4962" w:type="dxa"/>
+            <w:vAlign w:val="center"/>
+          </w:tcPr>
+          <w:p>
+            <w:pPr>
+              <w:rPr>
+                <w:rFonts w:cs="Times New Roman"/>
+                <w:sz w:val="20"/>
+                <w:szCs w:val="24"/>
+              </w:rPr>
+            </w:pPr>
+            <w:r>
+              <w:rPr>
+                <w:rFonts w:cs="Times New Roman"/>
+                <w:sz w:val="20"/>
+                <w:szCs w:val="24"/>
+              </w:rPr>
+              <w:t>In-memory file processing</w:t>
+            </w:r>
+          </w:p>
+        </w:tc>
+        <w:tc>
+          <w:tcPr>
+            <w:tcW w:w="5096" w:type="dxa"/>
+            <w:vAlign w:val="center"/>
+          </w:tcPr>
+          <w:p>
+            <w:pPr>
+              <w:rPr>
+                <w:rFonts w:cs="Times New Roman"/>
+                <w:sz w:val="20"/>
+                <w:szCs w:val="24"/>
+              </w:rPr>
+            </w:pPr>
+            <w:r>
+              <w:rPr>
+                <w:rFonts w:cs="Times New Roman"/>
+                <w:sz w:val="20"/>
+                <w:szCs w:val="24"/>
+              </w:rPr>
+              <w:t>Avoid retaining raw resume uploads</w:t>
+            </w:r>
+          </w:p>
+        </w:tc>
+      </w:tr>
+      <w:tr>
+        <w:trPr>
+          <w:trHeight w:val="547"/>
+          <w:jc w:val="center"/>
+        </w:trPr>
+        <w:tc>
+          <w:tcPr>
+            <w:tcW w:w="4962" w:type="dxa"/>
+            <w:vAlign w:val="center"/>
+          </w:tcPr>
+          <w:p>
+            <w:pPr>
+              <w:rPr>
+                <w:rFonts w:cs="Times New Roman"/>
+                <w:sz w:val="20"/>
+                <w:szCs w:val="24"/>
+              </w:rPr>
+            </w:pPr>
+            <w:r>
+              <w:rPr>
+                <w:rFonts w:cs="Times New Roman"/>
+                <w:sz w:val="20"/>
+                <w:szCs w:val="24"/>
+              </w:rPr>
+              <w:t>Rate limits + quotas</w:t>
+            </w:r>
+          </w:p>
+        </w:tc>
+        <w:tc>
+          <w:tcPr>
+            <w:tcW w:w="5096" w:type="dxa"/>
+            <w:vAlign w:val="center"/>
+          </w:tcPr>
+          <w:p>
+            <w:pPr>
+              <w:rPr>
+                <w:rFonts w:cs="Times New Roman"/>
+                <w:sz w:val="20"/>
+                <w:szCs w:val="24"/>
+              </w:rPr>
+            </w:pPr>
+            <w:r>
+              <w:rPr>
+                <w:rFonts w:cs="Times New Roman"/>
+                <w:sz w:val="20"/>
+                <w:szCs w:val="24"/>
+              </w:rPr>
+              <w:t>Control high-cost AI actions</w:t>
             </w:r>
           </w:p>
         </w:tc>
@@ -6622,7 +7916,7 @@
                 <w:sz w:val="20"/>
                 <w:szCs w:val="24"/>
               </w:rPr>
-              <w:t>Resume Analyzer</w:t>
+              <w:t>Fallback + timeouts</w:t>
             </w:r>
           </w:p>
         </w:tc>
@@ -6645,371 +7939,7 @@
                 <w:sz w:val="20"/>
                 <w:szCs w:val="24"/>
               </w:rPr>
-              <w:t>Complete — PDF and DOCX analysed in memory; skills, gaps, directional score, and the single highest-value revision.</w:t>
-            </w:r>
-          </w:p>
-        </w:tc>
-      </w:tr>
-      <w:tr>
-        <w:trPr>
-          <w:trHeight w:val="568"/>
-          <w:jc w:val="center"/>
-        </w:trPr>
-        <w:tc>
-          <w:tcPr>
-            <w:tcW w:w="4962" w:type="dxa"/>
-            <w:vAlign w:val="center"/>
-          </w:tcPr>
-          <w:p>
-            <w:pPr>
-              <w:rPr>
-                <w:rFonts w:cs="Times New Roman"/>
-                <w:sz w:val="20"/>
-                <w:szCs w:val="24"/>
-              </w:rPr>
-            </w:pPr>
-            <w:r>
-              <w:rPr>
-                <w:rFonts w:cs="Times New Roman"/>
-                <w:sz w:val="20"/>
-                <w:szCs w:val="24"/>
-              </w:rPr>
-              <w:t>Interview</w:t>
-            </w:r>
-          </w:p>
-        </w:tc>
-        <w:tc>
-          <w:tcPr>
-            <w:tcW w:w="5096" w:type="dxa"/>
-            <w:vAlign w:val="center"/>
-          </w:tcPr>
-          <w:p>
-            <w:pPr>
-              <w:rPr>
-                <w:rFonts w:cs="Times New Roman"/>
-                <w:sz w:val="20"/>
-                <w:szCs w:val="24"/>
-              </w:rPr>
-            </w:pPr>
-            <w:r>
-              <w:rPr>
-                <w:rFonts w:cs="Times New Roman"/>
-                <w:sz w:val="20"/>
-                <w:szCs w:val="24"/>
-              </w:rPr>
-              <w:t>Complete — typed and spoken practice over an authenticated WebSocket, with adaptive follow-ups and a session report.</w:t>
-            </w:r>
-          </w:p>
-        </w:tc>
-      </w:tr>
-      <w:tr>
-        <w:trPr>
-          <w:trHeight w:val="568"/>
-          <w:jc w:val="center"/>
-        </w:trPr>
-        <w:tc>
-          <w:tcPr>
-            <w:tcW w:w="4962" w:type="dxa"/>
-            <w:vAlign w:val="center"/>
-          </w:tcPr>
-          <w:p>
-            <w:pPr>
-              <w:rPr>
-                <w:rFonts w:cs="Times New Roman"/>
-                <w:sz w:val="20"/>
-                <w:szCs w:val="24"/>
-              </w:rPr>
-            </w:pPr>
-            <w:r>
-              <w:rPr>
-                <w:rFonts w:cs="Times New Roman"/>
-                <w:sz w:val="20"/>
-                <w:szCs w:val="24"/>
-              </w:rPr>
-              <w:t>Coaching</w:t>
-            </w:r>
-          </w:p>
-        </w:tc>
-        <w:tc>
-          <w:tcPr>
-            <w:tcW w:w="5096" w:type="dxa"/>
-            <w:vAlign w:val="center"/>
-          </w:tcPr>
-          <w:p>
-            <w:pPr>
-              <w:rPr>
-                <w:rFonts w:cs="Times New Roman"/>
-                <w:sz w:val="20"/>
-                <w:szCs w:val="24"/>
-              </w:rPr>
-            </w:pPr>
-            <w:r>
-              <w:rPr>
-                <w:rFonts w:cs="Times New Roman"/>
-                <w:sz w:val="20"/>
-                <w:szCs w:val="24"/>
-              </w:rPr>
-              <w:t>Complete — evidence-based takeaway, priority action, and next practice step.</w:t>
-            </w:r>
-          </w:p>
-        </w:tc>
-      </w:tr>
-      <w:tr>
-        <w:trPr>
-          <w:trHeight w:val="568"/>
-          <w:jc w:val="center"/>
-        </w:trPr>
-        <w:tc>
-          <w:tcPr>
-            <w:tcW w:w="4962" w:type="dxa"/>
-            <w:vAlign w:val="center"/>
-          </w:tcPr>
-          <w:p>
-            <w:pPr>
-              <w:rPr>
-                <w:rFonts w:cs="Times New Roman"/>
-                <w:sz w:val="20"/>
-                <w:szCs w:val="24"/>
-              </w:rPr>
-            </w:pPr>
-            <w:r>
-              <w:rPr>
-                <w:rFonts w:cs="Times New Roman"/>
-                <w:sz w:val="20"/>
-                <w:szCs w:val="24"/>
-              </w:rPr>
-              <w:t>Knowledge base</w:t>
-            </w:r>
-          </w:p>
-        </w:tc>
-        <w:tc>
-          <w:tcPr>
-            <w:tcW w:w="5096" w:type="dxa"/>
-            <w:vAlign w:val="center"/>
-          </w:tcPr>
-          <w:p>
-            <w:pPr>
-              <w:rPr>
-                <w:rFonts w:cs="Times New Roman"/>
-                <w:sz w:val="20"/>
-                <w:szCs w:val="24"/>
-              </w:rPr>
-            </w:pPr>
-            <w:r>
-              <w:rPr>
-                <w:rFonts w:cs="Times New Roman"/>
-                <w:sz w:val="20"/>
-                <w:szCs w:val="24"/>
-              </w:rPr>
-              <w:t>In progress — source upload and search are implemented; retrieval quality is still being validated against real documents.</w:t>
-            </w:r>
-          </w:p>
-        </w:tc>
-      </w:tr>
-      <w:tr>
-        <w:trPr>
-          <w:trHeight w:val="568"/>
-          <w:jc w:val="center"/>
-        </w:trPr>
-        <w:tc>
-          <w:tcPr>
-            <w:tcW w:w="4962" w:type="dxa"/>
-            <w:vAlign w:val="center"/>
-          </w:tcPr>
-          <w:p>
-            <w:pPr>
-              <w:rPr>
-                <w:rFonts w:cs="Times New Roman"/>
-                <w:sz w:val="20"/>
-                <w:szCs w:val="24"/>
-              </w:rPr>
-            </w:pPr>
-            <w:r>
-              <w:rPr>
-                <w:rFonts w:cs="Times New Roman"/>
-                <w:sz w:val="20"/>
-                <w:szCs w:val="24"/>
-              </w:rPr>
-              <w:t>Coaching workspaces</w:t>
-            </w:r>
-          </w:p>
-        </w:tc>
-        <w:tc>
-          <w:tcPr>
-            <w:tcW w:w="5096" w:type="dxa"/>
-            <w:vAlign w:val="center"/>
-          </w:tcPr>
-          <w:p>
-            <w:pPr>
-              <w:rPr>
-                <w:rFonts w:cs="Times New Roman"/>
-                <w:sz w:val="20"/>
-                <w:szCs w:val="24"/>
-              </w:rPr>
-            </w:pPr>
-            <w:r>
-              <w:rPr>
-                <w:rFonts w:cs="Times New Roman"/>
-                <w:sz w:val="20"/>
-                <w:szCs w:val="24"/>
-              </w:rPr>
-              <w:t>UI built — backend behavior not yet wired.</w:t>
-            </w:r>
-          </w:p>
-        </w:tc>
-      </w:tr>
-      <w:tr>
-        <w:trPr>
-          <w:trHeight w:val="568"/>
-          <w:jc w:val="center"/>
-        </w:trPr>
-        <w:tc>
-          <w:tcPr>
-            <w:tcW w:w="4962" w:type="dxa"/>
-            <w:vAlign w:val="center"/>
-          </w:tcPr>
-          <w:p>
-            <w:pPr>
-              <w:rPr>
-                <w:rFonts w:cs="Times New Roman"/>
-                <w:sz w:val="20"/>
-                <w:szCs w:val="24"/>
-              </w:rPr>
-            </w:pPr>
-            <w:r>
-              <w:rPr>
-                <w:rFonts w:cs="Times New Roman"/>
-                <w:sz w:val="20"/>
-                <w:szCs w:val="24"/>
-              </w:rPr>
-              <w:t>Assessment</w:t>
-            </w:r>
-          </w:p>
-        </w:tc>
-        <w:tc>
-          <w:tcPr>
-            <w:tcW w:w="5096" w:type="dxa"/>
-            <w:vAlign w:val="center"/>
-          </w:tcPr>
-          <w:p>
-            <w:pPr>
-              <w:rPr>
-                <w:rFonts w:cs="Times New Roman"/>
-                <w:sz w:val="20"/>
-                <w:szCs w:val="24"/>
-              </w:rPr>
-            </w:pPr>
-            <w:r>
-              <w:rPr>
-                <w:rFonts w:cs="Times New Roman"/>
-                <w:sz w:val="20"/>
-                <w:szCs w:val="24"/>
-              </w:rPr>
-              <w:t>UI built — backend behavior not yet wired.</w:t>
-            </w:r>
-          </w:p>
-        </w:tc>
-      </w:tr>
-      <w:tr>
-        <w:trPr>
-          <w:trHeight w:val="568"/>
-          <w:jc w:val="center"/>
-        </w:trPr>
-        <w:tc>
-          <w:tcPr>
-            <w:tcW w:w="4962" w:type="dxa"/>
-            <w:vAlign w:val="center"/>
-          </w:tcPr>
-          <w:p>
-            <w:pPr>
-              <w:rPr>
-                <w:rFonts w:cs="Times New Roman"/>
-                <w:sz w:val="20"/>
-                <w:szCs w:val="24"/>
-              </w:rPr>
-            </w:pPr>
-            <w:r>
-              <w:rPr>
-                <w:rFonts w:cs="Times New Roman"/>
-                <w:sz w:val="20"/>
-                <w:szCs w:val="24"/>
-              </w:rPr>
-              <w:t>Settings and provider keys</w:t>
-            </w:r>
-          </w:p>
-        </w:tc>
-        <w:tc>
-          <w:tcPr>
-            <w:tcW w:w="5096" w:type="dxa"/>
-            <w:vAlign w:val="center"/>
-          </w:tcPr>
-          <w:p>
-            <w:pPr>
-              <w:rPr>
-                <w:rFonts w:cs="Times New Roman"/>
-                <w:sz w:val="20"/>
-                <w:szCs w:val="24"/>
-              </w:rPr>
-            </w:pPr>
-            <w:r>
-              <w:rPr>
-                <w:rFonts w:cs="Times New Roman"/>
-                <w:sz w:val="20"/>
-                <w:szCs w:val="24"/>
-              </w:rPr>
-              <w:t>UI built — backend behavior not yet wired.</w:t>
-            </w:r>
-          </w:p>
-        </w:tc>
-      </w:tr>
-      <w:tr>
-        <w:trPr>
-          <w:trHeight w:val="568"/>
-          <w:jc w:val="center"/>
-        </w:trPr>
-        <w:tc>
-          <w:tcPr>
-            <w:tcW w:w="4962" w:type="dxa"/>
-            <w:vAlign w:val="center"/>
-          </w:tcPr>
-          <w:p>
-            <w:pPr>
-              <w:rPr>
-                <w:rFonts w:cs="Times New Roman"/>
-                <w:sz w:val="20"/>
-                <w:szCs w:val="24"/>
-              </w:rPr>
-            </w:pPr>
-            <w:r>
-              <w:rPr>
-                <w:rFonts w:cs="Times New Roman"/>
-                <w:sz w:val="20"/>
-                <w:szCs w:val="24"/>
-              </w:rPr>
-              <w:t>Account data rights</w:t>
-            </w:r>
-          </w:p>
-        </w:tc>
-        <w:tc>
-          <w:tcPr>
-            <w:tcW w:w="5096" w:type="dxa"/>
-            <w:vAlign w:val="center"/>
-          </w:tcPr>
-          <w:p>
-            <w:pPr>
-              <w:rPr>
-                <w:rFonts w:cs="Times New Roman"/>
-                <w:sz w:val="20"/>
-                <w:szCs w:val="24"/>
-              </w:rPr>
-            </w:pPr>
-            <w:r>
-              <w:rPr>
-                <w:rFonts w:cs="Times New Roman"/>
-                <w:sz w:val="20"/>
-                <w:szCs w:val="24"/>
-              </w:rPr>
-              <w:t>UI built — backend behavior not yet wired.</w:t>
+              <w:t>Reduce disruption during provider failure</w:t>
             </w:r>
           </w:p>
         </w:tc>
@@ -7017,554 +7947,22 @@
     </w:tbl>
     <w:p>
       <w:pPr>
-        <w:spacing w:after="120" w:line="276" w:lineRule="auto"/>
-        <w:jc w:val="both"/>
+        <w:pStyle w:val="Heading2"/>
+        <w:spacing w:before="100" w:after="80"/>
         <w:rPr>
           <w:rFonts w:ascii="Times New Roman" w:hAnsi="Times New Roman" w:cs="Times New Roman"/>
-          <w:sz w:val="24"/>
-          <w:szCs w:val="24"/>
-        </w:rPr>
-      </w:pPr>
-      <w:r>
-        <w:rPr>
-          <w:rFonts w:ascii="Times New Roman" w:hAnsi="Times New Roman" w:cs="Times New Roman"/>
-          <w:sz w:val="24"/>
-          <w:szCs w:val="24"/>
-        </w:rPr>
-        <w:t xml:space="preserve">The knowledge base is the one module that is partly built. Source upload and search are implemented, but retrieval quality is still being checked against real documents rather than only against test fixtures, so it is not being reported as complete.</w:t>
-      </w:r>
+        </w:rPr>
+      </w:pPr>
     </w:p>
     <w:p>
       <w:pPr>
-        <w:spacing w:after="120" w:line="276" w:lineRule="auto"/>
-        <w:jc w:val="both"/>
-        <w:rPr>
-          <w:rFonts w:ascii="Times New Roman" w:hAnsi="Times New Roman" w:cs="Times New Roman"/>
-          <w:sz w:val="24"/>
-          <w:szCs w:val="24"/>
-        </w:rPr>
-      </w:pPr>
-      <w:r>
-        <w:rPr>
-          <w:rFonts w:ascii="Times New Roman" w:hAnsi="Times New Roman" w:cs="Times New Roman"/>
-          <w:sz w:val="24"/>
-          <w:szCs w:val="24"/>
-        </w:rPr>
-        <w:t xml:space="preserve">One issue is worth recording because it changes how results are trusted. The knowledge base appeared to pass its automated tests, which supplied a stubbed embedding service. When it was exercised through the running application instead, the configured embedding model had been withdrawn by its provider and every request failed. The tests had therefore confirmed the code path, not the feature. Retrieval is now being re-validated against a live provider before the module is reported as complete.</w:t>
-      </w:r>
-    </w:p>
-    <w:p>
-      <w:pPr>
-        <w:spacing w:after="120" w:line="276" w:lineRule="auto"/>
-        <w:jc w:val="both"/>
-        <w:rPr>
-          <w:rFonts w:ascii="Times New Roman" w:hAnsi="Times New Roman" w:cs="Times New Roman"/>
-          <w:sz w:val="24"/>
-          <w:szCs w:val="24"/>
-        </w:rPr>
-      </w:pPr>
-      <w:r>
-        <w:rPr>
-          <w:rFonts w:ascii="Times New Roman" w:hAnsi="Times New Roman" w:cs="Times New Roman"/>
-          <w:sz w:val="24"/>
-          <w:szCs w:val="24"/>
-        </w:rPr>
-        <w:t xml:space="preserve">The remaining planned modules, together with capacity planning, backup and recovery procedures, and evaluation with real users, form the next stage of work. Until the status above changes, none of them should be treated as available.</w:t>
-      </w:r>
-    </w:p>
-    <w:p>
-      <w:pPr>
-        <w:spacing w:after="0" w:line="360" w:lineRule="auto"/>
-        <w:jc w:val="both"/>
-        <w:rPr>
-          <w:rFonts w:cs="Times New Roman"/>
-          <w:sz w:val="36"/>
-          <w:szCs w:val="36"/>
-        </w:rPr>
-      </w:pPr>
-    </w:p>
-    <w:p>
-      <w:pPr>
-        <w:spacing w:line="360" w:lineRule="auto"/>
-        <w:rPr>
-          <w:rFonts w:cs="Times New Roman"/>
-          <w:b/>
-          <w:bCs/>
-          <w:sz w:val="28"/>
-          <w:szCs w:val="28"/>
-        </w:rPr>
-      </w:pPr>
-      <w:r>
-        <w:rPr>
-          <w:rFonts w:cs="Times New Roman"/>
-          <w:b/>
-          <w:bCs/>
-          <w:sz w:val="28"/>
-          <w:szCs w:val="28"/>
-        </w:rPr>
-        <w:t>6. EXPECTED OUTCOMES AND APPLICATION</w:t>
-      </w:r>
-    </w:p>
-    <w:p>
-      <w:pPr>
         <w:pStyle w:val="Heading2"/>
         <w:spacing w:before="100" w:after="80"/>
         <w:rPr>
           <w:rFonts w:ascii="Times New Roman" w:hAnsi="Times New Roman" w:cs="Times New Roman"/>
         </w:rPr>
       </w:pPr>
-      <w:bookmarkStart w:id="20" w:name="_Toc241399995"/>
-      <w:r>
-        <w:rPr>
-          <w:rFonts w:ascii="Times New Roman" w:hAnsi="Times New Roman" w:cs="Times New Roman"/>
-        </w:rPr>
-        <w:t>6.1 Expected Outcomes</w:t>
-      </w:r>
-      <w:bookmarkEnd w:id="20"/>
-    </w:p>
-    <w:p>
-      <w:pPr>
-        <w:pStyle w:val="ListBullet"/>
-        <w:spacing w:line="360" w:lineRule="auto"/>
-        <w:rPr>
-          <w:sz w:val="32"/>
-          <w:szCs w:val="24"/>
-        </w:rPr>
-      </w:pPr>
-      <w:r>
-        <w:rPr>
-          <w:sz w:val="24"/>
-          <w:szCs w:val="24"/>
-        </w:rPr>
-        <w:t>A working prototype where a candidate can prepare for a target role, analyse a resume, practice an interview, and receive focused coaching.</w:t>
-      </w:r>
-    </w:p>
-    <w:p>
-      <w:pPr>
-        <w:pStyle w:val="ListBullet"/>
-        <w:spacing w:after="40" w:line="360" w:lineRule="auto"/>
-        <w:rPr>
-          <w:rFonts w:cs="Times New Roman"/>
-          <w:sz w:val="28"/>
-          <w:szCs w:val="28"/>
-        </w:rPr>
-      </w:pPr>
-      <w:r>
-        <w:rPr>
-          <w:rFonts w:cs="Times New Roman"/>
-          <w:sz w:val="24"/>
-          <w:szCs w:val="28"/>
-        </w:rPr>
-        <w:t>A Resume Analyzer that accepts PDF/DOCX files, identifies visible and missing skills, provides a directional readiness score, and prioritises the next revision.</w:t>
-      </w:r>
-    </w:p>
-    <w:p>
-      <w:pPr>
-        <w:pStyle w:val="ListBullet"/>
-        <w:spacing w:after="40" w:line="360" w:lineRule="auto"/>
-        <w:rPr>
-          <w:rFonts w:cs="Times New Roman"/>
-          <w:sz w:val="28"/>
-          <w:szCs w:val="28"/>
-        </w:rPr>
-      </w:pPr>
-      <w:r>
-        <w:rPr>
-          <w:rFonts w:cs="Times New Roman"/>
-          <w:sz w:val="24"/>
-          <w:szCs w:val="28"/>
-        </w:rPr>
-        <w:t>Secure candidate isolation through authenticated access, owner checks, Supabase row-level security, rate limits, and controlled WebSocket sessions.</w:t>
-      </w:r>
-    </w:p>
-    <w:p>
-      <w:pPr>
-        <w:pStyle w:val="ListBullet"/>
-        <w:spacing w:after="40" w:line="360" w:lineRule="auto"/>
-        <w:rPr>
-          <w:rFonts w:cs="Times New Roman"/>
-          <w:sz w:val="28"/>
-          <w:szCs w:val="28"/>
-        </w:rPr>
-      </w:pPr>
-      <w:r>
-        <w:rPr>
-          <w:rFonts w:cs="Times New Roman"/>
-          <w:sz w:val="24"/>
-          <w:szCs w:val="28"/>
-        </w:rPr>
-        <w:t>Provider fallback, request timeouts, quotas for high-cost analysis, and health monitoring to support dependable operation.</w:t>
-      </w:r>
-    </w:p>
-    <w:p>
-      <w:pPr>
-        <w:pStyle w:val="ListBullet"/>
-        <w:spacing w:after="40" w:line="360" w:lineRule="auto"/>
-        <w:rPr>
-          <w:rFonts w:cs="Times New Roman"/>
-          <w:sz w:val="28"/>
-          <w:szCs w:val="28"/>
-        </w:rPr>
-      </w:pPr>
-      <w:r>
-        <w:rPr>
-          <w:rFonts w:cs="Times New Roman"/>
-          <w:sz w:val="24"/>
-          <w:szCs w:val="28"/>
-        </w:rPr>
-        <w:t>A documented, extensible architecture suitable for future additions such as multilingual coaching, shared AI work queues, and broader candidate-approved knowledge retrieval.</w:t>
-      </w:r>
-    </w:p>
-    <w:p>
-      <w:pPr>
-        <w:pStyle w:val="ListBullet"/>
-        <w:numPr>
-          <w:ilvl w:val="0"/>
-          <w:numId w:val="0"/>
-        </w:numPr>
-        <w:spacing w:after="40" w:line="240" w:lineRule="auto"/>
-        <w:rPr>
-          <w:rFonts w:cs="Times New Roman"/>
-        </w:rPr>
-      </w:pPr>
-    </w:p>
-    <w:p>
-      <w:pPr>
-        <w:pStyle w:val="Heading2"/>
-        <w:spacing w:before="100" w:after="80"/>
-        <w:rPr>
-          <w:rFonts w:ascii="Times New Roman" w:hAnsi="Times New Roman" w:cs="Times New Roman"/>
-        </w:rPr>
-      </w:pPr>
-      <w:bookmarkStart w:id="21" w:name="_Toc241399996"/>
-      <w:r>
-        <w:rPr>
-          <w:rFonts w:ascii="Times New Roman" w:hAnsi="Times New Roman" w:cs="Times New Roman"/>
-        </w:rPr>
-        <w:t>6.2 Responsible Use and Future Readiness</w:t>
-      </w:r>
-      <w:bookmarkEnd w:id="21"/>
-    </w:p>
-    <w:p/>
-    <w:p>
-      <w:pPr>
-        <w:jc w:val="center"/>
-        <w:rPr>
-          <w:rFonts w:cs="Times New Roman"/>
-          <w:sz w:val="20"/>
-          <w:szCs w:val="24"/>
-        </w:rPr>
-      </w:pPr>
-      <w:r>
-        <w:rPr>
-          <w:rFonts w:cs="Times New Roman"/>
-          <w:sz w:val="20"/>
-          <w:szCs w:val="24"/>
-        </w:rPr>
-        <w:t>Table 9: Responsible-use design controls</w:t>
-      </w:r>
-    </w:p>
-    <w:tbl>
-      <w:tblPr>
-        <w:tblW w:w="10058" w:type="dxa"/>
-        <w:jc w:val="center"/>
-        <w:tblBorders>
-          <w:top w:val="single" w:sz="6" w:space="0" w:color="808080"/>
-          <w:left w:val="single" w:sz="6" w:space="0" w:color="808080"/>
-          <w:bottom w:val="single" w:sz="6" w:space="0" w:color="808080"/>
-          <w:right w:val="single" w:sz="6" w:space="0" w:color="808080"/>
-          <w:insideH w:val="single" w:sz="6" w:space="0" w:color="808080"/>
-          <w:insideV w:val="single" w:sz="6" w:space="0" w:color="808080"/>
-        </w:tblBorders>
-        <w:tblLook w:val="04A0" w:firstRow="1" w:lastRow="0" w:firstColumn="1" w:lastColumn="0" w:noHBand="0" w:noVBand="1"/>
-      </w:tblPr>
-      <w:tblGrid>
-        <w:gridCol w:w="4962"/>
-        <w:gridCol w:w="5096"/>
-      </w:tblGrid>
-      <w:tr>
-        <w:trPr>
-          <w:trHeight w:val="568"/>
-          <w:jc w:val="center"/>
-        </w:trPr>
-        <w:tc>
-          <w:tcPr>
-            <w:tcW w:w="4962" w:type="dxa"/>
-            <w:shd w:val="clear" w:color="auto" w:fill="EAF2F8"/>
-            <w:vAlign w:val="center"/>
-          </w:tcPr>
-          <w:p>
-            <w:pPr>
-              <w:rPr>
-                <w:rFonts w:cs="Times New Roman"/>
-                <w:sz w:val="20"/>
-                <w:szCs w:val="24"/>
-              </w:rPr>
-            </w:pPr>
-            <w:r>
-              <w:rPr>
-                <w:rFonts w:cs="Times New Roman"/>
-                <w:b/>
-                <w:sz w:val="20"/>
-                <w:szCs w:val="24"/>
-              </w:rPr>
-              <w:t>Design control</w:t>
-            </w:r>
-          </w:p>
-        </w:tc>
-        <w:tc>
-          <w:tcPr>
-            <w:tcW w:w="5096" w:type="dxa"/>
-            <w:shd w:val="clear" w:color="auto" w:fill="EAF2F8"/>
-            <w:vAlign w:val="center"/>
-          </w:tcPr>
-          <w:p>
-            <w:pPr>
-              <w:rPr>
-                <w:rFonts w:cs="Times New Roman"/>
-                <w:sz w:val="20"/>
-                <w:szCs w:val="24"/>
-              </w:rPr>
-            </w:pPr>
-            <w:r>
-              <w:rPr>
-                <w:rFonts w:cs="Times New Roman"/>
-                <w:b/>
-                <w:sz w:val="20"/>
-                <w:szCs w:val="24"/>
-              </w:rPr>
-              <w:t>Purpose</w:t>
-            </w:r>
-          </w:p>
-        </w:tc>
-      </w:tr>
-      <w:tr>
-        <w:trPr>
-          <w:trHeight w:val="568"/>
-          <w:jc w:val="center"/>
-        </w:trPr>
-        <w:tc>
-          <w:tcPr>
-            <w:tcW w:w="4962" w:type="dxa"/>
-            <w:vAlign w:val="center"/>
-          </w:tcPr>
-          <w:p>
-            <w:pPr>
-              <w:rPr>
-                <w:rFonts w:cs="Times New Roman"/>
-                <w:sz w:val="20"/>
-                <w:szCs w:val="24"/>
-              </w:rPr>
-            </w:pPr>
-            <w:r>
-              <w:rPr>
-                <w:rFonts w:cs="Times New Roman"/>
-                <w:sz w:val="20"/>
-                <w:szCs w:val="24"/>
-              </w:rPr>
-              <w:t>Owner checks + RLS</w:t>
-            </w:r>
-          </w:p>
-        </w:tc>
-        <w:tc>
-          <w:tcPr>
-            <w:tcW w:w="5096" w:type="dxa"/>
-            <w:vAlign w:val="center"/>
-          </w:tcPr>
-          <w:p>
-            <w:pPr>
-              <w:rPr>
-                <w:rFonts w:cs="Times New Roman"/>
-                <w:sz w:val="20"/>
-                <w:szCs w:val="24"/>
-              </w:rPr>
-            </w:pPr>
-            <w:r>
-              <w:rPr>
-                <w:rFonts w:cs="Times New Roman"/>
-                <w:sz w:val="20"/>
-                <w:szCs w:val="24"/>
-              </w:rPr>
-              <w:t>Keep each candidate's records isolated</w:t>
-            </w:r>
-          </w:p>
-        </w:tc>
-      </w:tr>
-      <w:tr>
-        <w:trPr>
-          <w:trHeight w:val="547"/>
-          <w:jc w:val="center"/>
-        </w:trPr>
-        <w:tc>
-          <w:tcPr>
-            <w:tcW w:w="4962" w:type="dxa"/>
-            <w:vAlign w:val="center"/>
-          </w:tcPr>
-          <w:p>
-            <w:pPr>
-              <w:rPr>
-                <w:rFonts w:cs="Times New Roman"/>
-                <w:sz w:val="20"/>
-                <w:szCs w:val="24"/>
-              </w:rPr>
-            </w:pPr>
-            <w:r>
-              <w:rPr>
-                <w:rFonts w:cs="Times New Roman"/>
-                <w:sz w:val="20"/>
-                <w:szCs w:val="24"/>
-              </w:rPr>
-              <w:t>In-memory file processing</w:t>
-            </w:r>
-          </w:p>
-        </w:tc>
-        <w:tc>
-          <w:tcPr>
-            <w:tcW w:w="5096" w:type="dxa"/>
-            <w:vAlign w:val="center"/>
-          </w:tcPr>
-          <w:p>
-            <w:pPr>
-              <w:rPr>
-                <w:rFonts w:cs="Times New Roman"/>
-                <w:sz w:val="20"/>
-                <w:szCs w:val="24"/>
-              </w:rPr>
-            </w:pPr>
-            <w:r>
-              <w:rPr>
-                <w:rFonts w:cs="Times New Roman"/>
-                <w:sz w:val="20"/>
-                <w:szCs w:val="24"/>
-              </w:rPr>
-              <w:t>Avoid retaining raw resume uploads</w:t>
-            </w:r>
-          </w:p>
-        </w:tc>
-      </w:tr>
-      <w:tr>
-        <w:trPr>
-          <w:trHeight w:val="547"/>
-          <w:jc w:val="center"/>
-        </w:trPr>
-        <w:tc>
-          <w:tcPr>
-            <w:tcW w:w="4962" w:type="dxa"/>
-            <w:vAlign w:val="center"/>
-          </w:tcPr>
-          <w:p>
-            <w:pPr>
-              <w:rPr>
-                <w:rFonts w:cs="Times New Roman"/>
-                <w:sz w:val="20"/>
-                <w:szCs w:val="24"/>
-              </w:rPr>
-            </w:pPr>
-            <w:r>
-              <w:rPr>
-                <w:rFonts w:cs="Times New Roman"/>
-                <w:sz w:val="20"/>
-                <w:szCs w:val="24"/>
-              </w:rPr>
-              <w:t>Rate limits + quotas</w:t>
-            </w:r>
-          </w:p>
-        </w:tc>
-        <w:tc>
-          <w:tcPr>
-            <w:tcW w:w="5096" w:type="dxa"/>
-            <w:vAlign w:val="center"/>
-          </w:tcPr>
-          <w:p>
-            <w:pPr>
-              <w:rPr>
-                <w:rFonts w:cs="Times New Roman"/>
-                <w:sz w:val="20"/>
-                <w:szCs w:val="24"/>
-              </w:rPr>
-            </w:pPr>
-            <w:r>
-              <w:rPr>
-                <w:rFonts w:cs="Times New Roman"/>
-                <w:sz w:val="20"/>
-                <w:szCs w:val="24"/>
-              </w:rPr>
-              <w:t>Control high-cost AI actions</w:t>
-            </w:r>
-          </w:p>
-        </w:tc>
-      </w:tr>
-      <w:tr>
-        <w:trPr>
-          <w:trHeight w:val="568"/>
-          <w:jc w:val="center"/>
-        </w:trPr>
-        <w:tc>
-          <w:tcPr>
-            <w:tcW w:w="4962" w:type="dxa"/>
-            <w:vAlign w:val="center"/>
-          </w:tcPr>
-          <w:p>
-            <w:pPr>
-              <w:rPr>
-                <w:rFonts w:cs="Times New Roman"/>
-                <w:sz w:val="20"/>
-                <w:szCs w:val="24"/>
-              </w:rPr>
-            </w:pPr>
-            <w:r>
-              <w:rPr>
-                <w:rFonts w:cs="Times New Roman"/>
-                <w:sz w:val="20"/>
-                <w:szCs w:val="24"/>
-              </w:rPr>
-              <w:t>Fallback + timeouts</w:t>
-            </w:r>
-          </w:p>
-        </w:tc>
-        <w:tc>
-          <w:tcPr>
-            <w:tcW w:w="5096" w:type="dxa"/>
-            <w:vAlign w:val="center"/>
-          </w:tcPr>
-          <w:p>
-            <w:pPr>
-              <w:rPr>
-                <w:rFonts w:cs="Times New Roman"/>
-                <w:sz w:val="20"/>
-                <w:szCs w:val="24"/>
-              </w:rPr>
-            </w:pPr>
-            <w:r>
-              <w:rPr>
-                <w:rFonts w:cs="Times New Roman"/>
-                <w:sz w:val="20"/>
-                <w:szCs w:val="24"/>
-              </w:rPr>
-              <w:t>Reduce disruption during provider failure</w:t>
-            </w:r>
-          </w:p>
-        </w:tc>
-      </w:tr>
-    </w:tbl>
-    <w:p>
-      <w:pPr>
-        <w:pStyle w:val="Heading2"/>
-        <w:spacing w:before="100" w:after="80"/>
-        <w:rPr>
-          <w:rFonts w:ascii="Times New Roman" w:hAnsi="Times New Roman" w:cs="Times New Roman"/>
-        </w:rPr>
-      </w:pPr>
-    </w:p>
-    <w:p>
-      <w:pPr>
-        <w:pStyle w:val="Heading2"/>
-        <w:spacing w:before="100" w:after="80"/>
-        <w:rPr>
-          <w:rFonts w:ascii="Times New Roman" w:hAnsi="Times New Roman" w:cs="Times New Roman"/>
-        </w:rPr>
-      </w:pPr>
-      <w:bookmarkStart w:id="22" w:name="_Toc241399997"/>
+      <w:bookmarkStart w:id="22" w:name="_Toc241585821"/>
       <w:r>
         <w:rPr>
           <w:rFonts w:ascii="Times New Roman" w:hAnsi="Times New Roman" w:cs="Times New Roman"/>
@@ -7631,6 +8029,7 @@
           <w:sz w:val="32"/>
           <w:szCs w:val="32"/>
         </w:rPr>
+        <w:lastRenderedPageBreak/>
         <w:t>Hustlrzz</w:t>
       </w:r>
       <w:r>
@@ -7864,7 +8263,23 @@
           <w:rFonts w:eastAsiaTheme="majorEastAsia"/>
           <w:color w:val="000000"/>
         </w:rPr>
-        <w:t>Yar Khan                                                                         </w:t>
+        <w:t>Yar Khan                                                                    </w:t>
+      </w:r>
+      <w:r>
+        <w:rPr>
+          <w:rStyle w:val="normaltextrun"/>
+          <w:rFonts w:eastAsiaTheme="majorEastAsia"/>
+          <w:color w:val="000000"/>
+        </w:rPr>
+        <w:t xml:space="preserve"> </w:t>
+      </w:r>
+      <w:r>
+        <w:rPr>
+          <w:rStyle w:val="normaltextrun"/>
+          <w:rFonts w:eastAsiaTheme="majorEastAsia"/>
+          <w:color w:val="000000"/>
+        </w:rPr>
+        <w:t>     </w:t>
       </w:r>
       <w:r>
         <w:rPr>
@@ -8217,15 +8632,7 @@
           <w:b/>
           <w:bCs/>
         </w:rPr>
-        <w:t>Er. Ashish Agrawal                                                                                                 </w:t>
-      </w:r>
-      <w:r>
-        <w:rPr>
-          <w:rStyle w:val="apple-converted-space"/>
-          <w:b/>
-          <w:bCs/>
-        </w:rPr>
-        <w:t> </w:t>
+        <w:t>Mr</w:t>
       </w:r>
       <w:r>
         <w:rPr>
@@ -8234,6 +8641,23 @@
           <w:b/>
           <w:bCs/>
         </w:rPr>
+        <w:t>. Ashish Agrawal                                                                                                 </w:t>
+      </w:r>
+      <w:r>
+        <w:rPr>
+          <w:rStyle w:val="apple-converted-space"/>
+          <w:b/>
+          <w:bCs/>
+        </w:rPr>
+        <w:t> </w:t>
+      </w:r>
+      <w:r>
+        <w:rPr>
+          <w:rStyle w:val="normaltextrun"/>
+          <w:rFonts w:eastAsiaTheme="majorEastAsia"/>
+          <w:b/>
+          <w:bCs/>
+        </w:rPr>
         <w:t>Ms. Sakshi Goel</w:t>
       </w:r>
       <w:r>
@@ -8296,7 +8720,23 @@
           <w:szCs w:val="22"/>
         </w:rPr>
         <w:tab/>
+      </w:r>
+      <w:r>
+        <w:rPr>
+          <w:rStyle w:val="tabchar"/>
+          <w:rFonts w:ascii="Calibri" w:hAnsi="Calibri" w:cs="Calibri"/>
+          <w:sz w:val="22"/>
+          <w:szCs w:val="22"/>
+        </w:rPr>
         <w:tab/>
+      </w:r>
+      <w:r>
+        <w:rPr>
+          <w:rStyle w:val="tabchar"/>
+          <w:rFonts w:ascii="Calibri" w:hAnsi="Calibri" w:cs="Calibri"/>
+          <w:sz w:val="22"/>
+          <w:szCs w:val="22"/>
+        </w:rPr>
         <w:tab/>
       </w:r>
       <w:r>
@@ -8317,7 +8757,23 @@
           <w:szCs w:val="22"/>
         </w:rPr>
         <w:tab/>
+      </w:r>
+      <w:r>
+        <w:rPr>
+          <w:rStyle w:val="tabchar"/>
+          <w:rFonts w:ascii="Calibri" w:hAnsi="Calibri" w:cs="Calibri"/>
+          <w:sz w:val="22"/>
+          <w:szCs w:val="22"/>
+        </w:rPr>
         <w:tab/>
+      </w:r>
+      <w:r>
+        <w:rPr>
+          <w:rStyle w:val="tabchar"/>
+          <w:rFonts w:ascii="Calibri" w:hAnsi="Calibri" w:cs="Calibri"/>
+          <w:sz w:val="22"/>
+          <w:szCs w:val="22"/>
+        </w:rPr>
         <w:tab/>
       </w:r>
       <w:r>
@@ -8635,7 +9091,23 @@
           <w:b/>
           <w:bCs/>
         </w:rPr>
-        <w:t>September 2026</w:t>
+        <w:t>September</w:t>
+      </w:r>
+      <w:r>
+        <w:rPr>
+          <w:rStyle w:val="eop"/>
+          <w:b/>
+          <w:bCs/>
+        </w:rPr>
+        <w:t>,</w:t>
+      </w:r>
+      <w:r>
+        <w:rPr>
+          <w:rStyle w:val="eop"/>
+          <w:b/>
+          <w:bCs/>
+        </w:rPr>
+        <w:t xml:space="preserve"> 2026</w:t>
       </w:r>
     </w:p>
     <w:p>
@@ -8662,7 +9134,7 @@
 </file>
 
 <file path=word/endnotes.xml><?xml version="1.0" encoding="utf-8"?>
-<w:endnotes xmlns:wpc="http://schemas.microsoft.com/office/word/2010/wordprocessingCanvas" xmlns:cx="http://schemas.microsoft.com/office/drawing/2014/chartex" xmlns:cx1="http://schemas.microsoft.com/office/drawing/2015/9/8/chartex" xmlns:cx2="http://schemas.microsoft.com/office/drawing/2015/10/21/chartex" xmlns:cx3="http://schemas.microsoft.com/office/drawing/2016/5/9/chartex" xmlns:cx4="http://schemas.microsoft.com/office/drawing/2016/5/10/chartex" xmlns:cx5="http://schemas.microsoft.com/office/drawing/2016/5/11/chartex" xmlns:cx6="http://schemas.microsoft.com/office/drawing/2016/5/12/chartex" xmlns:cx7="http://schemas.microsoft.com/office/drawing/2016/5/13/chartex" xmlns:cx8="http://schemas.microsoft.com/office/drawing/2016/5/14/chartex" xmlns:mc="http://schemas.openxmlformats.org/markup-compatibility/2006" xmlns:aink="http://schemas.microsoft.com/office/drawing/2016/ink" xmlns:am3d="http://schemas.microsoft.com/office/drawing/2017/model3d" xmlns:o="urn:schemas-microsoft-com:office:office" xmlns:oel="http://schemas.microsoft.com/office/2019/extlst" xmlns:r="http://schemas.openxmlformats.org/officeDocument/2006/relationships" xmlns:m="http://schemas.openxmlformats.org/officeDocument/2006/math" xmlns:v="urn:schemas-microsoft-com:vml" xmlns:wp14="http://schemas.microsoft.com/office/word/2010/wordprocessingDrawing" xmlns:wp="http://schemas.openxmlformats.org/drawingml/2006/wordprocessingDrawing" xmlns:w10="urn:schemas-microsoft-com:office:word" xmlns:w="http://schemas.openxmlformats.org/wordprocessingml/2006/main" xmlns:w14="http://schemas.microsoft.com/office/word/2010/wordml" xmlns:w15="http://schemas.microsoft.com/office/word/2012/wordml" xmlns:w16cex="http://schemas.microsoft.com/office/word/2018/wordml/cex" xmlns:w16cid="http://schemas.microsoft.com/office/word/2016/wordml/cid" xmlns:w16="http://schemas.microsoft.com/office/word/2018/wordml" xmlns:w16sdtdh="http://schemas.microsoft.com/office/word/2020/wordml/sdtdatahash" xmlns:w16se="http://schemas.microsoft.com/office/word/2015/wordml/symex" xmlns:wpg="http://schemas.microsoft.com/office/word/2010/wordprocessingGroup" xmlns:wpi="http://schemas.microsoft.com/office/word/2010/wordprocessingInk" xmlns:wne="http://schemas.microsoft.com/office/word/2006/wordml" xmlns:wps="http://schemas.microsoft.com/office/word/2010/wordprocessingShape" mc:Ignorable="w14 w15 w16se w16cid w16 w16cex w16sdtdh wp14">
+<w:endnotes xmlns:wpc="http://schemas.microsoft.com/office/word/2010/wordprocessingCanvas" xmlns:cx="http://schemas.microsoft.com/office/drawing/2014/chartex" xmlns:cx1="http://schemas.microsoft.com/office/drawing/2015/9/8/chartex" xmlns:cx2="http://schemas.microsoft.com/office/drawing/2015/10/21/chartex" xmlns:cx3="http://schemas.microsoft.com/office/drawing/2016/5/9/chartex" xmlns:cx4="http://schemas.microsoft.com/office/drawing/2016/5/10/chartex" xmlns:cx5="http://schemas.microsoft.com/office/drawing/2016/5/11/chartex" xmlns:cx6="http://schemas.microsoft.com/office/drawing/2016/5/12/chartex" xmlns:cx7="http://schemas.microsoft.com/office/drawing/2016/5/13/chartex" xmlns:cx8="http://schemas.microsoft.com/office/drawing/2016/5/14/chartex" xmlns:mc="http://schemas.openxmlformats.org/markup-compatibility/2006" xmlns:aink="http://schemas.microsoft.com/office/drawing/2016/ink" xmlns:am3d="http://schemas.microsoft.com/office/drawing/2017/model3d" xmlns:o="urn:schemas-microsoft-com:office:office" xmlns:r="http://schemas.openxmlformats.org/officeDocument/2006/relationships" xmlns:m="http://schemas.openxmlformats.org/officeDocument/2006/math" xmlns:v="urn:schemas-microsoft-com:vml" xmlns:wp14="http://schemas.microsoft.com/office/word/2010/wordprocessingDrawing" xmlns:wp="http://schemas.openxmlformats.org/drawingml/2006/wordprocessingDrawing" xmlns:w10="urn:schemas-microsoft-com:office:word" xmlns:w="http://schemas.openxmlformats.org/wordprocessingml/2006/main" xmlns:w14="http://schemas.microsoft.com/office/word/2010/wordml" xmlns:w15="http://schemas.microsoft.com/office/word/2012/wordml" xmlns:w16cex="http://schemas.microsoft.com/office/word/2018/wordml/cex" xmlns:w16cid="http://schemas.microsoft.com/office/word/2016/wordml/cid" xmlns:w16="http://schemas.microsoft.com/office/word/2018/wordml" xmlns:w16se="http://schemas.microsoft.com/office/word/2015/wordml/symex" xmlns:wpg="http://schemas.microsoft.com/office/word/2010/wordprocessingGroup" xmlns:wpi="http://schemas.microsoft.com/office/word/2010/wordprocessingInk" xmlns:wne="http://schemas.microsoft.com/office/word/2006/wordml" xmlns:wps="http://schemas.microsoft.com/office/word/2010/wordprocessingShape" mc:Ignorable="w14 w15 w16se w16cid w16 w16cex wp14">
   <w:endnote w:type="separator" w:id="-1">
     <w:p>
       <w:pPr>
@@ -8687,7 +9159,7 @@
 </file>
 
 <file path=word/footer1.xml><?xml version="1.0" encoding="utf-8"?>
-<w:ftr xmlns:wpc="http://schemas.microsoft.com/office/word/2010/wordprocessingCanvas" xmlns:cx="http://schemas.microsoft.com/office/drawing/2014/chartex" xmlns:cx1="http://schemas.microsoft.com/office/drawing/2015/9/8/chartex" xmlns:cx2="http://schemas.microsoft.com/office/drawing/2015/10/21/chartex" xmlns:cx3="http://schemas.microsoft.com/office/drawing/2016/5/9/chartex" xmlns:cx4="http://schemas.microsoft.com/office/drawing/2016/5/10/chartex" xmlns:cx5="http://schemas.microsoft.com/office/drawing/2016/5/11/chartex" xmlns:cx6="http://schemas.microsoft.com/office/drawing/2016/5/12/chartex" xmlns:cx7="http://schemas.microsoft.com/office/drawing/2016/5/13/chartex" xmlns:cx8="http://schemas.microsoft.com/office/drawing/2016/5/14/chartex" xmlns:mc="http://schemas.openxmlformats.org/markup-compatibility/2006" xmlns:aink="http://schemas.microsoft.com/office/drawing/2016/ink" xmlns:am3d="http://schemas.microsoft.com/office/drawing/2017/model3d" xmlns:o="urn:schemas-microsoft-com:office:office" xmlns:oel="http://schemas.microsoft.com/office/2019/extlst" xmlns:r="http://schemas.openxmlformats.org/officeDocument/2006/relationships" xmlns:m="http://schemas.openxmlformats.org/officeDocument/2006/math" xmlns:v="urn:schemas-microsoft-com:vml" xmlns:wp14="http://schemas.microsoft.com/office/word/2010/wordprocessingDrawing" xmlns:wp="http://schemas.openxmlformats.org/drawingml/2006/wordprocessingDrawing" xmlns:w10="urn:schemas-microsoft-com:office:word" xmlns:w="http://schemas.openxmlformats.org/wordprocessingml/2006/main" xmlns:w14="http://schemas.microsoft.com/office/word/2010/wordml" xmlns:w15="http://schemas.microsoft.com/office/word/2012/wordml" xmlns:w16cex="http://schemas.microsoft.com/office/word/2018/wordml/cex" xmlns:w16cid="http://schemas.microsoft.com/office/word/2016/wordml/cid" xmlns:w16="http://schemas.microsoft.com/office/word/2018/wordml" xmlns:w16sdtdh="http://schemas.microsoft.com/office/word/2020/wordml/sdtdatahash" xmlns:w16se="http://schemas.microsoft.com/office/word/2015/wordml/symex" xmlns:wpg="http://schemas.microsoft.com/office/word/2010/wordprocessingGroup" xmlns:wpi="http://schemas.microsoft.com/office/word/2010/wordprocessingInk" xmlns:wne="http://schemas.microsoft.com/office/word/2006/wordml" xmlns:wps="http://schemas.microsoft.com/office/word/2010/wordprocessingShape" mc:Ignorable="w14 w15 w16se w16cid w16 w16cex w16sdtdh wp14">
+<w:ftr xmlns:wpc="http://schemas.microsoft.com/office/word/2010/wordprocessingCanvas" xmlns:cx="http://schemas.microsoft.com/office/drawing/2014/chartex" xmlns:cx1="http://schemas.microsoft.com/office/drawing/2015/9/8/chartex" xmlns:cx2="http://schemas.microsoft.com/office/drawing/2015/10/21/chartex" xmlns:cx3="http://schemas.microsoft.com/office/drawing/2016/5/9/chartex" xmlns:cx4="http://schemas.microsoft.com/office/drawing/2016/5/10/chartex" xmlns:cx5="http://schemas.microsoft.com/office/drawing/2016/5/11/chartex" xmlns:cx6="http://schemas.microsoft.com/office/drawing/2016/5/12/chartex" xmlns:cx7="http://schemas.microsoft.com/office/drawing/2016/5/13/chartex" xmlns:cx8="http://schemas.microsoft.com/office/drawing/2016/5/14/chartex" xmlns:mc="http://schemas.openxmlformats.org/markup-compatibility/2006" xmlns:aink="http://schemas.microsoft.com/office/drawing/2016/ink" xmlns:am3d="http://schemas.microsoft.com/office/drawing/2017/model3d" xmlns:o="urn:schemas-microsoft-com:office:office" xmlns:r="http://schemas.openxmlformats.org/officeDocument/2006/relationships" xmlns:m="http://schemas.openxmlformats.org/officeDocument/2006/math" xmlns:v="urn:schemas-microsoft-com:vml" xmlns:wp14="http://schemas.microsoft.com/office/word/2010/wordprocessingDrawing" xmlns:wp="http://schemas.openxmlformats.org/drawingml/2006/wordprocessingDrawing" xmlns:w10="urn:schemas-microsoft-com:office:word" xmlns:w="http://schemas.openxmlformats.org/wordprocessingml/2006/main" xmlns:w14="http://schemas.microsoft.com/office/word/2010/wordml" xmlns:w15="http://schemas.microsoft.com/office/word/2012/wordml" xmlns:w16cex="http://schemas.microsoft.com/office/word/2018/wordml/cex" xmlns:w16cid="http://schemas.microsoft.com/office/word/2016/wordml/cid" xmlns:w16="http://schemas.microsoft.com/office/word/2018/wordml" xmlns:w16se="http://schemas.microsoft.com/office/word/2015/wordml/symex" xmlns:wpg="http://schemas.microsoft.com/office/word/2010/wordprocessingGroup" xmlns:wpi="http://schemas.microsoft.com/office/word/2010/wordprocessingInk" xmlns:wne="http://schemas.microsoft.com/office/word/2006/wordml" xmlns:wps="http://schemas.microsoft.com/office/word/2010/wordprocessingShape" mc:Ignorable="w14 w15 w16se w16cid w16 w16cex wp14">
   <w:p>
     <w:pPr>
       <w:pStyle w:val="Footer"/>
@@ -8705,7 +9177,7 @@
 </file>
 
 <file path=word/footer2.xml><?xml version="1.0" encoding="utf-8"?>
-<w:ftr xmlns:wpc="http://schemas.microsoft.com/office/word/2010/wordprocessingCanvas" xmlns:cx="http://schemas.microsoft.com/office/drawing/2014/chartex" xmlns:cx1="http://schemas.microsoft.com/office/drawing/2015/9/8/chartex" xmlns:cx2="http://schemas.microsoft.com/office/drawing/2015/10/21/chartex" xmlns:cx3="http://schemas.microsoft.com/office/drawing/2016/5/9/chartex" xmlns:cx4="http://schemas.microsoft.com/office/drawing/2016/5/10/chartex" xmlns:cx5="http://schemas.microsoft.com/office/drawing/2016/5/11/chartex" xmlns:cx6="http://schemas.microsoft.com/office/drawing/2016/5/12/chartex" xmlns:cx7="http://schemas.microsoft.com/office/drawing/2016/5/13/chartex" xmlns:cx8="http://schemas.microsoft.com/office/drawing/2016/5/14/chartex" xmlns:mc="http://schemas.openxmlformats.org/markup-compatibility/2006" xmlns:aink="http://schemas.microsoft.com/office/drawing/2016/ink" xmlns:am3d="http://schemas.microsoft.com/office/drawing/2017/model3d" xmlns:o="urn:schemas-microsoft-com:office:office" xmlns:oel="http://schemas.microsoft.com/office/2019/extlst" xmlns:r="http://schemas.openxmlformats.org/officeDocument/2006/relationships" xmlns:m="http://schemas.openxmlformats.org/officeDocument/2006/math" xmlns:v="urn:schemas-microsoft-com:vml" xmlns:wp14="http://schemas.microsoft.com/office/word/2010/wordprocessingDrawing" xmlns:wp="http://schemas.openxmlformats.org/drawingml/2006/wordprocessingDrawing" xmlns:w10="urn:schemas-microsoft-com:office:word" xmlns:w="http://schemas.openxmlformats.org/wordprocessingml/2006/main" xmlns:w14="http://schemas.microsoft.com/office/word/2010/wordml" xmlns:w15="http://schemas.microsoft.com/office/word/2012/wordml" xmlns:w16cex="http://schemas.microsoft.com/office/word/2018/wordml/cex" xmlns:w16cid="http://schemas.microsoft.com/office/word/2016/wordml/cid" xmlns:w16="http://schemas.microsoft.com/office/word/2018/wordml" xmlns:w16sdtdh="http://schemas.microsoft.com/office/word/2020/wordml/sdtdatahash" xmlns:w16se="http://schemas.microsoft.com/office/word/2015/wordml/symex" xmlns:wpg="http://schemas.microsoft.com/office/word/2010/wordprocessingGroup" xmlns:wpi="http://schemas.microsoft.com/office/word/2010/wordprocessingInk" xmlns:wne="http://schemas.microsoft.com/office/word/2006/wordml" xmlns:wps="http://schemas.microsoft.com/office/word/2010/wordprocessingShape" mc:Ignorable="w14 w15 w16se w16cid w16 w16cex w16sdtdh wp14">
+<w:ftr xmlns:wpc="http://schemas.microsoft.com/office/word/2010/wordprocessingCanvas" xmlns:cx="http://schemas.microsoft.com/office/drawing/2014/chartex" xmlns:cx1="http://schemas.microsoft.com/office/drawing/2015/9/8/chartex" xmlns:cx2="http://schemas.microsoft.com/office/drawing/2015/10/21/chartex" xmlns:cx3="http://schemas.microsoft.com/office/drawing/2016/5/9/chartex" xmlns:cx4="http://schemas.microsoft.com/office/drawing/2016/5/10/chartex" xmlns:cx5="http://schemas.microsoft.com/office/drawing/2016/5/11/chartex" xmlns:cx6="http://schemas.microsoft.com/office/drawing/2016/5/12/chartex" xmlns:cx7="http://schemas.microsoft.com/office/drawing/2016/5/13/chartex" xmlns:cx8="http://schemas.microsoft.com/office/drawing/2016/5/14/chartex" xmlns:mc="http://schemas.openxmlformats.org/markup-compatibility/2006" xmlns:aink="http://schemas.microsoft.com/office/drawing/2016/ink" xmlns:am3d="http://schemas.microsoft.com/office/drawing/2017/model3d" xmlns:o="urn:schemas-microsoft-com:office:office" xmlns:r="http://schemas.openxmlformats.org/officeDocument/2006/relationships" xmlns:m="http://schemas.openxmlformats.org/officeDocument/2006/math" xmlns:v="urn:schemas-microsoft-com:vml" xmlns:wp14="http://schemas.microsoft.com/office/word/2010/wordprocessingDrawing" xmlns:wp="http://schemas.openxmlformats.org/drawingml/2006/wordprocessingDrawing" xmlns:w10="urn:schemas-microsoft-com:office:word" xmlns:w="http://schemas.openxmlformats.org/wordprocessingml/2006/main" xmlns:w14="http://schemas.microsoft.com/office/word/2010/wordml" xmlns:w15="http://schemas.microsoft.com/office/word/2012/wordml" xmlns:w16cex="http://schemas.microsoft.com/office/word/2018/wordml/cex" xmlns:w16cid="http://schemas.microsoft.com/office/word/2016/wordml/cid" xmlns:w16="http://schemas.microsoft.com/office/word/2018/wordml" xmlns:w16se="http://schemas.microsoft.com/office/word/2015/wordml/symex" xmlns:wpg="http://schemas.microsoft.com/office/word/2010/wordprocessingGroup" xmlns:wpi="http://schemas.microsoft.com/office/word/2010/wordprocessingInk" xmlns:wne="http://schemas.microsoft.com/office/word/2006/wordml" xmlns:wps="http://schemas.microsoft.com/office/word/2010/wordprocessingShape" mc:Ignorable="w14 w15 w16se w16cid w16 w16cex wp14">
   <w:p>
     <w:pPr>
       <w:pStyle w:val="Footer"/>
@@ -8715,7 +9187,7 @@
 </file>
 
 <file path=word/footer3.xml><?xml version="1.0" encoding="utf-8"?>
-<w:ftr xmlns:wpc="http://schemas.microsoft.com/office/word/2010/wordprocessingCanvas" xmlns:cx="http://schemas.microsoft.com/office/drawing/2014/chartex" xmlns:cx1="http://schemas.microsoft.com/office/drawing/2015/9/8/chartex" xmlns:cx2="http://schemas.microsoft.com/office/drawing/2015/10/21/chartex" xmlns:cx3="http://schemas.microsoft.com/office/drawing/2016/5/9/chartex" xmlns:cx4="http://schemas.microsoft.com/office/drawing/2016/5/10/chartex" xmlns:cx5="http://schemas.microsoft.com/office/drawing/2016/5/11/chartex" xmlns:cx6="http://schemas.microsoft.com/office/drawing/2016/5/12/chartex" xmlns:cx7="http://schemas.microsoft.com/office/drawing/2016/5/13/chartex" xmlns:cx8="http://schemas.microsoft.com/office/drawing/2016/5/14/chartex" xmlns:mc="http://schemas.openxmlformats.org/markup-compatibility/2006" xmlns:aink="http://schemas.microsoft.com/office/drawing/2016/ink" xmlns:am3d="http://schemas.microsoft.com/office/drawing/2017/model3d" xmlns:o="urn:schemas-microsoft-com:office:office" xmlns:oel="http://schemas.microsoft.com/office/2019/extlst" xmlns:r="http://schemas.openxmlformats.org/officeDocument/2006/relationships" xmlns:m="http://schemas.openxmlformats.org/officeDocument/2006/math" xmlns:v="urn:schemas-microsoft-com:vml" xmlns:wp14="http://schemas.microsoft.com/office/word/2010/wordprocessingDrawing" xmlns:wp="http://schemas.openxmlformats.org/drawingml/2006/wordprocessingDrawing" xmlns:w10="urn:schemas-microsoft-com:office:word" xmlns:w="http://schemas.openxmlformats.org/wordprocessingml/2006/main" xmlns:w14="http://schemas.microsoft.com/office/word/2010/wordml" xmlns:w15="http://schemas.microsoft.com/office/word/2012/wordml" xmlns:w16cex="http://schemas.microsoft.com/office/word/2018/wordml/cex" xmlns:w16cid="http://schemas.microsoft.com/office/word/2016/wordml/cid" xmlns:w16="http://schemas.microsoft.com/office/word/2018/wordml" xmlns:w16sdtdh="http://schemas.microsoft.com/office/word/2020/wordml/sdtdatahash" xmlns:w16se="http://schemas.microsoft.com/office/word/2015/wordml/symex" xmlns:wpg="http://schemas.microsoft.com/office/word/2010/wordprocessingGroup" xmlns:wpi="http://schemas.microsoft.com/office/word/2010/wordprocessingInk" xmlns:wne="http://schemas.microsoft.com/office/word/2006/wordml" xmlns:wps="http://schemas.microsoft.com/office/word/2010/wordprocessingShape" mc:Ignorable="w14 w15 w16se w16cid w16 w16cex w16sdtdh wp14">
+<w:ftr xmlns:wpc="http://schemas.microsoft.com/office/word/2010/wordprocessingCanvas" xmlns:cx="http://schemas.microsoft.com/office/drawing/2014/chartex" xmlns:cx1="http://schemas.microsoft.com/office/drawing/2015/9/8/chartex" xmlns:cx2="http://schemas.microsoft.com/office/drawing/2015/10/21/chartex" xmlns:cx3="http://schemas.microsoft.com/office/drawing/2016/5/9/chartex" xmlns:cx4="http://schemas.microsoft.com/office/drawing/2016/5/10/chartex" xmlns:cx5="http://schemas.microsoft.com/office/drawing/2016/5/11/chartex" xmlns:cx6="http://schemas.microsoft.com/office/drawing/2016/5/12/chartex" xmlns:cx7="http://schemas.microsoft.com/office/drawing/2016/5/13/chartex" xmlns:cx8="http://schemas.microsoft.com/office/drawing/2016/5/14/chartex" xmlns:mc="http://schemas.openxmlformats.org/markup-compatibility/2006" xmlns:aink="http://schemas.microsoft.com/office/drawing/2016/ink" xmlns:am3d="http://schemas.microsoft.com/office/drawing/2017/model3d" xmlns:o="urn:schemas-microsoft-com:office:office" xmlns:r="http://schemas.openxmlformats.org/officeDocument/2006/relationships" xmlns:m="http://schemas.openxmlformats.org/officeDocument/2006/math" xmlns:v="urn:schemas-microsoft-com:vml" xmlns:wp14="http://schemas.microsoft.com/office/word/2010/wordprocessingDrawing" xmlns:wp="http://schemas.openxmlformats.org/drawingml/2006/wordprocessingDrawing" xmlns:w10="urn:schemas-microsoft-com:office:word" xmlns:w="http://schemas.openxmlformats.org/wordprocessingml/2006/main" xmlns:w14="http://schemas.microsoft.com/office/word/2010/wordml" xmlns:w15="http://schemas.microsoft.com/office/word/2012/wordml" xmlns:w16cex="http://schemas.microsoft.com/office/word/2018/wordml/cex" xmlns:w16cid="http://schemas.microsoft.com/office/word/2016/wordml/cid" xmlns:w16="http://schemas.microsoft.com/office/word/2018/wordml" xmlns:w16se="http://schemas.microsoft.com/office/word/2015/wordml/symex" xmlns:wpg="http://schemas.microsoft.com/office/word/2010/wordprocessingGroup" xmlns:wpi="http://schemas.microsoft.com/office/word/2010/wordprocessingInk" xmlns:wne="http://schemas.microsoft.com/office/word/2006/wordml" xmlns:wps="http://schemas.microsoft.com/office/word/2010/wordprocessingShape" mc:Ignorable="w14 w15 w16se w16cid w16 w16cex wp14">
   <w:p>
     <w:pPr>
       <w:pStyle w:val="Footer"/>
@@ -8741,7 +9213,7 @@
 </file>
 
 <file path=word/footnotes.xml><?xml version="1.0" encoding="utf-8"?>
-<w:footnotes xmlns:wpc="http://schemas.microsoft.com/office/word/2010/wordprocessingCanvas" xmlns:cx="http://schemas.microsoft.com/office/drawing/2014/chartex" xmlns:cx1="http://schemas.microsoft.com/office/drawing/2015/9/8/chartex" xmlns:cx2="http://schemas.microsoft.com/office/drawing/2015/10/21/chartex" xmlns:cx3="http://schemas.microsoft.com/office/drawing/2016/5/9/chartex" xmlns:cx4="http://schemas.microsoft.com/office/drawing/2016/5/10/chartex" xmlns:cx5="http://schemas.microsoft.com/office/drawing/2016/5/11/chartex" xmlns:cx6="http://schemas.microsoft.com/office/drawing/2016/5/12/chartex" xmlns:cx7="http://schemas.microsoft.com/office/drawing/2016/5/13/chartex" xmlns:cx8="http://schemas.microsoft.com/office/drawing/2016/5/14/chartex" xmlns:mc="http://schemas.openxmlformats.org/markup-compatibility/2006" xmlns:aink="http://schemas.microsoft.com/office/drawing/2016/ink" xmlns:am3d="http://schemas.microsoft.com/office/drawing/2017/model3d" xmlns:o="urn:schemas-microsoft-com:office:office" xmlns:oel="http://schemas.microsoft.com/office/2019/extlst" xmlns:r="http://schemas.openxmlformats.org/officeDocument/2006/relationships" xmlns:m="http://schemas.openxmlformats.org/officeDocument/2006/math" xmlns:v="urn:schemas-microsoft-com:vml" xmlns:wp14="http://schemas.microsoft.com/office/word/2010/wordprocessingDrawing" xmlns:wp="http://schemas.openxmlformats.org/drawingml/2006/wordprocessingDrawing" xmlns:w10="urn:schemas-microsoft-com:office:word" xmlns:w="http://schemas.openxmlformats.org/wordprocessingml/2006/main" xmlns:w14="http://schemas.microsoft.com/office/word/2010/wordml" xmlns:w15="http://schemas.microsoft.com/office/word/2012/wordml" xmlns:w16cex="http://schemas.microsoft.com/office/word/2018/wordml/cex" xmlns:w16cid="http://schemas.microsoft.com/office/word/2016/wordml/cid" xmlns:w16="http://schemas.microsoft.com/office/word/2018/wordml" xmlns:w16sdtdh="http://schemas.microsoft.com/office/word/2020/wordml/sdtdatahash" xmlns:w16se="http://schemas.microsoft.com/office/word/2015/wordml/symex" xmlns:wpg="http://schemas.microsoft.com/office/word/2010/wordprocessingGroup" xmlns:wpi="http://schemas.microsoft.com/office/word/2010/wordprocessingInk" xmlns:wne="http://schemas.microsoft.com/office/word/2006/wordml" xmlns:wps="http://schemas.microsoft.com/office/word/2010/wordprocessingShape" mc:Ignorable="w14 w15 w16se w16cid w16 w16cex w16sdtdh wp14">
+<w:footnotes xmlns:wpc="http://schemas.microsoft.com/office/word/2010/wordprocessingCanvas" xmlns:cx="http://schemas.microsoft.com/office/drawing/2014/chartex" xmlns:cx1="http://schemas.microsoft.com/office/drawing/2015/9/8/chartex" xmlns:cx2="http://schemas.microsoft.com/office/drawing/2015/10/21/chartex" xmlns:cx3="http://schemas.microsoft.com/office/drawing/2016/5/9/chartex" xmlns:cx4="http://schemas.microsoft.com/office/drawing/2016/5/10/chartex" xmlns:cx5="http://schemas.microsoft.com/office/drawing/2016/5/11/chartex" xmlns:cx6="http://schemas.microsoft.com/office/drawing/2016/5/12/chartex" xmlns:cx7="http://schemas.microsoft.com/office/drawing/2016/5/13/chartex" xmlns:cx8="http://schemas.microsoft.com/office/drawing/2016/5/14/chartex" xmlns:mc="http://schemas.openxmlformats.org/markup-compatibility/2006" xmlns:aink="http://schemas.microsoft.com/office/drawing/2016/ink" xmlns:am3d="http://schemas.microsoft.com/office/drawing/2017/model3d" xmlns:o="urn:schemas-microsoft-com:office:office" xmlns:r="http://schemas.openxmlformats.org/officeDocument/2006/relationships" xmlns:m="http://schemas.openxmlformats.org/officeDocument/2006/math" xmlns:v="urn:schemas-microsoft-com:vml" xmlns:wp14="http://schemas.microsoft.com/office/word/2010/wordprocessingDrawing" xmlns:wp="http://schemas.openxmlformats.org/drawingml/2006/wordprocessingDrawing" xmlns:w10="urn:schemas-microsoft-com:office:word" xmlns:w="http://schemas.openxmlformats.org/wordprocessingml/2006/main" xmlns:w14="http://schemas.microsoft.com/office/word/2010/wordml" xmlns:w15="http://schemas.microsoft.com/office/word/2012/wordml" xmlns:w16cex="http://schemas.microsoft.com/office/word/2018/wordml/cex" xmlns:w16cid="http://schemas.microsoft.com/office/word/2016/wordml/cid" xmlns:w16="http://schemas.microsoft.com/office/word/2018/wordml" xmlns:w16se="http://schemas.microsoft.com/office/word/2015/wordml/symex" xmlns:wpg="http://schemas.microsoft.com/office/word/2010/wordprocessingGroup" xmlns:wpi="http://schemas.microsoft.com/office/word/2010/wordprocessingInk" xmlns:wne="http://schemas.microsoft.com/office/word/2006/wordml" xmlns:wps="http://schemas.microsoft.com/office/word/2010/wordprocessingShape" mc:Ignorable="w14 w15 w16se w16cid w16 w16cex wp14">
   <w:footnote w:type="separator" w:id="-1">
     <w:p>
       <w:pPr>
@@ -8766,7 +9238,7 @@
 </file>
 
 <file path=word/header1.xml><?xml version="1.0" encoding="utf-8"?>
-<w:hdr xmlns:wpc="http://schemas.microsoft.com/office/word/2010/wordprocessingCanvas" xmlns:cx="http://schemas.microsoft.com/office/drawing/2014/chartex" xmlns:cx1="http://schemas.microsoft.com/office/drawing/2015/9/8/chartex" xmlns:cx2="http://schemas.microsoft.com/office/drawing/2015/10/21/chartex" xmlns:cx3="http://schemas.microsoft.com/office/drawing/2016/5/9/chartex" xmlns:cx4="http://schemas.microsoft.com/office/drawing/2016/5/10/chartex" xmlns:cx5="http://schemas.microsoft.com/office/drawing/2016/5/11/chartex" xmlns:cx6="http://schemas.microsoft.com/office/drawing/2016/5/12/chartex" xmlns:cx7="http://schemas.microsoft.com/office/drawing/2016/5/13/chartex" xmlns:cx8="http://schemas.microsoft.com/office/drawing/2016/5/14/chartex" xmlns:mc="http://schemas.openxmlformats.org/markup-compatibility/2006" xmlns:aink="http://schemas.microsoft.com/office/drawing/2016/ink" xmlns:am3d="http://schemas.microsoft.com/office/drawing/2017/model3d" xmlns:o="urn:schemas-microsoft-com:office:office" xmlns:oel="http://schemas.microsoft.com/office/2019/extlst" xmlns:r="http://schemas.openxmlformats.org/officeDocument/2006/relationships" xmlns:m="http://schemas.openxmlformats.org/officeDocument/2006/math" xmlns:v="urn:schemas-microsoft-com:vml" xmlns:wp14="http://schemas.microsoft.com/office/word/2010/wordprocessingDrawing" xmlns:wp="http://schemas.openxmlformats.org/drawingml/2006/wordprocessingDrawing" xmlns:w10="urn:schemas-microsoft-com:office:word" xmlns:w="http://schemas.openxmlformats.org/wordprocessingml/2006/main" xmlns:w14="http://schemas.microsoft.com/office/word/2010/wordml" xmlns:w15="http://schemas.microsoft.com/office/word/2012/wordml" xmlns:w16cex="http://schemas.microsoft.com/office/word/2018/wordml/cex" xmlns:w16cid="http://schemas.microsoft.com/office/word/2016/wordml/cid" xmlns:w16="http://schemas.microsoft.com/office/word/2018/wordml" xmlns:w16sdtdh="http://schemas.microsoft.com/office/word/2020/wordml/sdtdatahash" xmlns:w16se="http://schemas.microsoft.com/office/word/2015/wordml/symex" xmlns:wpg="http://schemas.microsoft.com/office/word/2010/wordprocessingGroup" xmlns:wpi="http://schemas.microsoft.com/office/word/2010/wordprocessingInk" xmlns:wne="http://schemas.microsoft.com/office/word/2006/wordml" xmlns:wps="http://schemas.microsoft.com/office/word/2010/wordprocessingShape" mc:Ignorable="w14 w15 w16se w16cid w16 w16cex w16sdtdh wp14">
+<w:hdr xmlns:wpc="http://schemas.microsoft.com/office/word/2010/wordprocessingCanvas" xmlns:cx="http://schemas.microsoft.com/office/drawing/2014/chartex" xmlns:cx1="http://schemas.microsoft.com/office/drawing/2015/9/8/chartex" xmlns:cx2="http://schemas.microsoft.com/office/drawing/2015/10/21/chartex" xmlns:cx3="http://schemas.microsoft.com/office/drawing/2016/5/9/chartex" xmlns:cx4="http://schemas.microsoft.com/office/drawing/2016/5/10/chartex" xmlns:cx5="http://schemas.microsoft.com/office/drawing/2016/5/11/chartex" xmlns:cx6="http://schemas.microsoft.com/office/drawing/2016/5/12/chartex" xmlns:cx7="http://schemas.microsoft.com/office/drawing/2016/5/13/chartex" xmlns:cx8="http://schemas.microsoft.com/office/drawing/2016/5/14/chartex" xmlns:mc="http://schemas.openxmlformats.org/markup-compatibility/2006" xmlns:aink="http://schemas.microsoft.com/office/drawing/2016/ink" xmlns:am3d="http://schemas.microsoft.com/office/drawing/2017/model3d" xmlns:o="urn:schemas-microsoft-com:office:office" xmlns:r="http://schemas.openxmlformats.org/officeDocument/2006/relationships" xmlns:m="http://schemas.openxmlformats.org/officeDocument/2006/math" xmlns:v="urn:schemas-microsoft-com:vml" xmlns:wp14="http://schemas.microsoft.com/office/word/2010/wordprocessingDrawing" xmlns:wp="http://schemas.openxmlformats.org/drawingml/2006/wordprocessingDrawing" xmlns:w10="urn:schemas-microsoft-com:office:word" xmlns:w="http://schemas.openxmlformats.org/wordprocessingml/2006/main" xmlns:w14="http://schemas.microsoft.com/office/word/2010/wordml" xmlns:w15="http://schemas.microsoft.com/office/word/2012/wordml" xmlns:w16cex="http://schemas.microsoft.com/office/word/2018/wordml/cex" xmlns:w16cid="http://schemas.microsoft.com/office/word/2016/wordml/cid" xmlns:w16="http://schemas.microsoft.com/office/word/2018/wordml" xmlns:w16se="http://schemas.microsoft.com/office/word/2015/wordml/symex" xmlns:wpg="http://schemas.microsoft.com/office/word/2010/wordprocessingGroup" xmlns:wpi="http://schemas.microsoft.com/office/word/2010/wordprocessingInk" xmlns:wne="http://schemas.microsoft.com/office/word/2006/wordml" xmlns:wps="http://schemas.microsoft.com/office/word/2010/wordprocessingShape" mc:Ignorable="w14 w15 w16se w16cid w16 w16cex wp14">
   <w:p>
     <w:pPr>
       <w:pStyle w:val="Header"/>
@@ -8776,7 +9248,7 @@
 </file>
 
 <file path=word/header2.xml><?xml version="1.0" encoding="utf-8"?>
-<w:hdr xmlns:wpc="http://schemas.microsoft.com/office/word/2010/wordprocessingCanvas" xmlns:cx="http://schemas.microsoft.com/office/drawing/2014/chartex" xmlns:cx1="http://schemas.microsoft.com/office/drawing/2015/9/8/chartex" xmlns:cx2="http://schemas.microsoft.com/office/drawing/2015/10/21/chartex" xmlns:cx3="http://schemas.microsoft.com/office/drawing/2016/5/9/chartex" xmlns:cx4="http://schemas.microsoft.com/office/drawing/2016/5/10/chartex" xmlns:cx5="http://schemas.microsoft.com/office/drawing/2016/5/11/chartex" xmlns:cx6="http://schemas.microsoft.com/office/drawing/2016/5/12/chartex" xmlns:cx7="http://schemas.microsoft.com/office/drawing/2016/5/13/chartex" xmlns:cx8="http://schemas.microsoft.com/office/drawing/2016/5/14/chartex" xmlns:mc="http://schemas.openxmlformats.org/markup-compatibility/2006" xmlns:aink="http://schemas.microsoft.com/office/drawing/2016/ink" xmlns:am3d="http://schemas.microsoft.com/office/drawing/2017/model3d" xmlns:o="urn:schemas-microsoft-com:office:office" xmlns:oel="http://schemas.microsoft.com/office/2019/extlst" xmlns:r="http://schemas.openxmlformats.org/officeDocument/2006/relationships" xmlns:m="http://schemas.openxmlformats.org/officeDocument/2006/math" xmlns:v="urn:schemas-microsoft-com:vml" xmlns:wp14="http://schemas.microsoft.com/office/word/2010/wordprocessingDrawing" xmlns:wp="http://schemas.openxmlformats.org/drawingml/2006/wordprocessingDrawing" xmlns:w10="urn:schemas-microsoft-com:office:word" xmlns:w="http://schemas.openxmlformats.org/wordprocessingml/2006/main" xmlns:w14="http://schemas.microsoft.com/office/word/2010/wordml" xmlns:w15="http://schemas.microsoft.com/office/word/2012/wordml" xmlns:w16cex="http://schemas.microsoft.com/office/word/2018/wordml/cex" xmlns:w16cid="http://schemas.microsoft.com/office/word/2016/wordml/cid" xmlns:w16="http://schemas.microsoft.com/office/word/2018/wordml" xmlns:w16sdtdh="http://schemas.microsoft.com/office/word/2020/wordml/sdtdatahash" xmlns:w16se="http://schemas.microsoft.com/office/word/2015/wordml/symex" xmlns:wpg="http://schemas.microsoft.com/office/word/2010/wordprocessingGroup" xmlns:wpi="http://schemas.microsoft.com/office/word/2010/wordprocessingInk" xmlns:wne="http://schemas.microsoft.com/office/word/2006/wordml" xmlns:wps="http://schemas.microsoft.com/office/word/2010/wordprocessingShape" mc:Ignorable="w14 w15 w16se w16cid w16 w16cex w16sdtdh wp14">
+<w:hdr xmlns:wpc="http://schemas.microsoft.com/office/word/2010/wordprocessingCanvas" xmlns:cx="http://schemas.microsoft.com/office/drawing/2014/chartex" xmlns:cx1="http://schemas.microsoft.com/office/drawing/2015/9/8/chartex" xmlns:cx2="http://schemas.microsoft.com/office/drawing/2015/10/21/chartex" xmlns:cx3="http://schemas.microsoft.com/office/drawing/2016/5/9/chartex" xmlns:cx4="http://schemas.microsoft.com/office/drawing/2016/5/10/chartex" xmlns:cx5="http://schemas.microsoft.com/office/drawing/2016/5/11/chartex" xmlns:cx6="http://schemas.microsoft.com/office/drawing/2016/5/12/chartex" xmlns:cx7="http://schemas.microsoft.com/office/drawing/2016/5/13/chartex" xmlns:cx8="http://schemas.microsoft.com/office/drawing/2016/5/14/chartex" xmlns:mc="http://schemas.openxmlformats.org/markup-compatibility/2006" xmlns:aink="http://schemas.microsoft.com/office/drawing/2016/ink" xmlns:am3d="http://schemas.microsoft.com/office/drawing/2017/model3d" xmlns:o="urn:schemas-microsoft-com:office:office" xmlns:r="http://schemas.openxmlformats.org/officeDocument/2006/relationships" xmlns:m="http://schemas.openxmlformats.org/officeDocument/2006/math" xmlns:v="urn:schemas-microsoft-com:vml" xmlns:wp14="http://schemas.microsoft.com/office/word/2010/wordprocessingDrawing" xmlns:wp="http://schemas.openxmlformats.org/drawingml/2006/wordprocessingDrawing" xmlns:w10="urn:schemas-microsoft-com:office:word" xmlns:w="http://schemas.openxmlformats.org/wordprocessingml/2006/main" xmlns:w14="http://schemas.microsoft.com/office/word/2010/wordml" xmlns:w15="http://schemas.microsoft.com/office/word/2012/wordml" xmlns:w16cex="http://schemas.microsoft.com/office/word/2018/wordml/cex" xmlns:w16cid="http://schemas.microsoft.com/office/word/2016/wordml/cid" xmlns:w16="http://schemas.microsoft.com/office/word/2018/wordml" xmlns:w16se="http://schemas.microsoft.com/office/word/2015/wordml/symex" xmlns:wpg="http://schemas.microsoft.com/office/word/2010/wordprocessingGroup" xmlns:wpi="http://schemas.microsoft.com/office/word/2010/wordprocessingInk" xmlns:wne="http://schemas.microsoft.com/office/word/2006/wordml" xmlns:wps="http://schemas.microsoft.com/office/word/2010/wordprocessingShape" mc:Ignorable="w14 w15 w16se w16cid w16 w16cex wp14">
   <w:p>
     <w:pPr>
       <w:pStyle w:val="Header"/>
@@ -8786,7 +9258,7 @@
 </file>
 
 <file path=word/numbering.xml><?xml version="1.0" encoding="utf-8"?>
-<w:numbering xmlns:wpc="http://schemas.microsoft.com/office/word/2010/wordprocessingCanvas" xmlns:cx="http://schemas.microsoft.com/office/drawing/2014/chartex" xmlns:cx1="http://schemas.microsoft.com/office/drawing/2015/9/8/chartex" xmlns:cx2="http://schemas.microsoft.com/office/drawing/2015/10/21/chartex" xmlns:cx3="http://schemas.microsoft.com/office/drawing/2016/5/9/chartex" xmlns:cx4="http://schemas.microsoft.com/office/drawing/2016/5/10/chartex" xmlns:cx5="http://schemas.microsoft.com/office/drawing/2016/5/11/chartex" xmlns:cx6="http://schemas.microsoft.com/office/drawing/2016/5/12/chartex" xmlns:cx7="http://schemas.microsoft.com/office/drawing/2016/5/13/chartex" xmlns:cx8="http://schemas.microsoft.com/office/drawing/2016/5/14/chartex" xmlns:mc="http://schemas.openxmlformats.org/markup-compatibility/2006" xmlns:aink="http://schemas.microsoft.com/office/drawing/2016/ink" xmlns:am3d="http://schemas.microsoft.com/office/drawing/2017/model3d" xmlns:o="urn:schemas-microsoft-com:office:office" xmlns:oel="http://schemas.microsoft.com/office/2019/extlst" xmlns:r="http://schemas.openxmlformats.org/officeDocument/2006/relationships" xmlns:m="http://schemas.openxmlformats.org/officeDocument/2006/math" xmlns:v="urn:schemas-microsoft-com:vml" xmlns:wp14="http://schemas.microsoft.com/office/word/2010/wordprocessingDrawing" xmlns:wp="http://schemas.openxmlformats.org/drawingml/2006/wordprocessingDrawing" xmlns:w10="urn:schemas-microsoft-com:office:word" xmlns:w="http://schemas.openxmlformats.org/wordprocessingml/2006/main" xmlns:w14="http://schemas.microsoft.com/office/word/2010/wordml" xmlns:w15="http://schemas.microsoft.com/office/word/2012/wordml" xmlns:w16cex="http://schemas.microsoft.com/office/word/2018/wordml/cex" xmlns:w16cid="http://schemas.microsoft.com/office/word/2016/wordml/cid" xmlns:w16="http://schemas.microsoft.com/office/word/2018/wordml" xmlns:w16sdtdh="http://schemas.microsoft.com/office/word/2020/wordml/sdtdatahash" xmlns:w16se="http://schemas.microsoft.com/office/word/2015/wordml/symex" xmlns:wpg="http://schemas.microsoft.com/office/word/2010/wordprocessingGroup" xmlns:wpi="http://schemas.microsoft.com/office/word/2010/wordprocessingInk" xmlns:wne="http://schemas.microsoft.com/office/word/2006/wordml" xmlns:wps="http://schemas.microsoft.com/office/word/2010/wordprocessingShape" mc:Ignorable="w14 w15 w16se w16cid w16 w16cex w16sdtdh wp14">
+<w:numbering xmlns:wpc="http://schemas.microsoft.com/office/word/2010/wordprocessingCanvas" xmlns:cx="http://schemas.microsoft.com/office/drawing/2014/chartex" xmlns:cx1="http://schemas.microsoft.com/office/drawing/2015/9/8/chartex" xmlns:cx2="http://schemas.microsoft.com/office/drawing/2015/10/21/chartex" xmlns:cx3="http://schemas.microsoft.com/office/drawing/2016/5/9/chartex" xmlns:cx4="http://schemas.microsoft.com/office/drawing/2016/5/10/chartex" xmlns:cx5="http://schemas.microsoft.com/office/drawing/2016/5/11/chartex" xmlns:cx6="http://schemas.microsoft.com/office/drawing/2016/5/12/chartex" xmlns:cx7="http://schemas.microsoft.com/office/drawing/2016/5/13/chartex" xmlns:cx8="http://schemas.microsoft.com/office/drawing/2016/5/14/chartex" xmlns:mc="http://schemas.openxmlformats.org/markup-compatibility/2006" xmlns:aink="http://schemas.microsoft.com/office/drawing/2016/ink" xmlns:am3d="http://schemas.microsoft.com/office/drawing/2017/model3d" xmlns:o="urn:schemas-microsoft-com:office:office" xmlns:r="http://schemas.openxmlformats.org/officeDocument/2006/relationships" xmlns:m="http://schemas.openxmlformats.org/officeDocument/2006/math" xmlns:v="urn:schemas-microsoft-com:vml" xmlns:wp14="http://schemas.microsoft.com/office/word/2010/wordprocessingDrawing" xmlns:wp="http://schemas.openxmlformats.org/drawingml/2006/wordprocessingDrawing" xmlns:w10="urn:schemas-microsoft-com:office:word" xmlns:w="http://schemas.openxmlformats.org/wordprocessingml/2006/main" xmlns:w14="http://schemas.microsoft.com/office/word/2010/wordml" xmlns:w15="http://schemas.microsoft.com/office/word/2012/wordml" xmlns:w16cex="http://schemas.microsoft.com/office/word/2018/wordml/cex" xmlns:w16cid="http://schemas.microsoft.com/office/word/2016/wordml/cid" xmlns:w16="http://schemas.microsoft.com/office/word/2018/wordml" xmlns:w16se="http://schemas.microsoft.com/office/word/2015/wordml/symex" xmlns:wpg="http://schemas.microsoft.com/office/word/2010/wordprocessingGroup" xmlns:wpi="http://schemas.microsoft.com/office/word/2010/wordprocessingInk" xmlns:wne="http://schemas.microsoft.com/office/word/2006/wordml" xmlns:wps="http://schemas.microsoft.com/office/word/2010/wordprocessingShape" mc:Ignorable="w14 w15 w16se w16cid w16 w16cex wp14">
   <w:abstractNum w:abstractNumId="0" w15:restartNumberingAfterBreak="0">
     <w:nsid w:val="FFFFFF7C"/>
     <w:multiLevelType w:val="singleLevel"/>
@@ -9071,41 +9543,41 @@
       </w:rPr>
     </w:lvl>
   </w:abstractNum>
-  <w:num w:numId="1" w16cid:durableId="1639917357">
+  <w:num w:numId="1">
     <w:abstractNumId w:val="8"/>
   </w:num>
-  <w:num w:numId="2" w16cid:durableId="560411556">
+  <w:num w:numId="2">
     <w:abstractNumId w:val="6"/>
   </w:num>
-  <w:num w:numId="3" w16cid:durableId="1130784565">
+  <w:num w:numId="3">
     <w:abstractNumId w:val="5"/>
   </w:num>
-  <w:num w:numId="4" w16cid:durableId="1124737923">
+  <w:num w:numId="4">
     <w:abstractNumId w:val="4"/>
   </w:num>
-  <w:num w:numId="5" w16cid:durableId="1819345887">
+  <w:num w:numId="5">
     <w:abstractNumId w:val="7"/>
   </w:num>
-  <w:num w:numId="6" w16cid:durableId="1657562393">
+  <w:num w:numId="6">
     <w:abstractNumId w:val="3"/>
   </w:num>
-  <w:num w:numId="7" w16cid:durableId="1715150833">
+  <w:num w:numId="7">
     <w:abstractNumId w:val="2"/>
   </w:num>
-  <w:num w:numId="8" w16cid:durableId="111019013">
+  <w:num w:numId="8">
     <w:abstractNumId w:val="1"/>
   </w:num>
-  <w:num w:numId="9" w16cid:durableId="259026577">
+  <w:num w:numId="9">
     <w:abstractNumId w:val="0"/>
   </w:num>
-  <w:num w:numId="10" w16cid:durableId="598296361">
+  <w:num w:numId="10">
     <w:abstractNumId w:val="9"/>
   </w:num>
 </w:numbering>
 </file>
 
 <file path=word/styles.xml><?xml version="1.0" encoding="utf-8"?>
-<w:styles xmlns:mc="http://schemas.openxmlformats.org/markup-compatibility/2006" xmlns:r="http://schemas.openxmlformats.org/officeDocument/2006/relationships" xmlns:w="http://schemas.openxmlformats.org/wordprocessingml/2006/main" xmlns:w14="http://schemas.microsoft.com/office/word/2010/wordml" xmlns:w15="http://schemas.microsoft.com/office/word/2012/wordml" xmlns:w16cex="http://schemas.microsoft.com/office/word/2018/wordml/cex" xmlns:w16cid="http://schemas.microsoft.com/office/word/2016/wordml/cid" xmlns:w16="http://schemas.microsoft.com/office/word/2018/wordml" xmlns:w16sdtdh="http://schemas.microsoft.com/office/word/2020/wordml/sdtdatahash" xmlns:w16se="http://schemas.microsoft.com/office/word/2015/wordml/symex" mc:Ignorable="w14 w15 w16se w16cid w16 w16cex w16sdtdh">
+<w:styles xmlns:mc="http://schemas.openxmlformats.org/markup-compatibility/2006" xmlns:r="http://schemas.openxmlformats.org/officeDocument/2006/relationships" xmlns:w="http://schemas.openxmlformats.org/wordprocessingml/2006/main" xmlns:w14="http://schemas.microsoft.com/office/word/2010/wordml" xmlns:w15="http://schemas.microsoft.com/office/word/2012/wordml" xmlns:w16cex="http://schemas.microsoft.com/office/word/2018/wordml/cex" xmlns:w16cid="http://schemas.microsoft.com/office/word/2016/wordml/cid" xmlns:w16="http://schemas.microsoft.com/office/word/2018/wordml" xmlns:w16se="http://schemas.microsoft.com/office/word/2015/wordml/symex" mc:Ignorable="w14 w15 w16se w16cid w16 w16cex">
   <w:docDefaults>
     <w:rPrDefault>
       <w:rPr>

</xml_diff>